<commit_message>
Working on final report and renaming some stuff
</commit_message>
<xml_diff>
--- a/Doumentation/Implementation of a Ray Tracer.docx
+++ b/Doumentation/Implementation of a Ray Tracer.docx
@@ -7,19 +7,263 @@
         <w:jc w:val="center"/>
         <w:rPr>
           <w:rFonts w:ascii="Times New Roman" w:hAnsi="Times New Roman" w:cs="Times New Roman"/>
-          <w:sz w:val="32"/>
-          <w:szCs w:val="32"/>
-        </w:rPr>
-      </w:pPr>
-      <w:r>
-        <w:rPr>
-          <w:rFonts w:ascii="Times New Roman" w:hAnsi="Times New Roman" w:cs="Times New Roman"/>
           <w:b/>
           <w:bCs/>
           <w:sz w:val="32"/>
           <w:szCs w:val="32"/>
           <w:u w:val="single"/>
         </w:rPr>
+      </w:pPr>
+      <w:r>
+        <w:rPr>
+          <w:rFonts w:ascii="Times New Roman" w:hAnsi="Times New Roman" w:cs="Times New Roman"/>
+          <w:b/>
+          <w:bCs/>
+          <w:noProof/>
+          <w:sz w:val="28"/>
+          <w:szCs w:val="28"/>
+        </w:rPr>
+        <mc:AlternateContent>
+          <mc:Choice Requires="wps">
+            <w:drawing>
+              <wp:anchor distT="0" distB="0" distL="114300" distR="114300" simplePos="0" relativeHeight="251659264" behindDoc="0" locked="0" layoutInCell="1" allowOverlap="1" wp14:anchorId="2932DED4" wp14:editId="21DD3017">
+                <wp:simplePos x="0" y="0"/>
+                <wp:positionH relativeFrom="margin">
+                  <wp:align>left</wp:align>
+                </wp:positionH>
+                <wp:positionV relativeFrom="paragraph">
+                  <wp:posOffset>3124200</wp:posOffset>
+                </wp:positionV>
+                <wp:extent cx="6027420" cy="228600"/>
+                <wp:effectExtent l="0" t="0" r="11430" b="19050"/>
+                <wp:wrapNone/>
+                <wp:docPr id="606070308" name="Rectangle 1"/>
+                <wp:cNvGraphicFramePr/>
+                <a:graphic xmlns:a="http://schemas.openxmlformats.org/drawingml/2006/main">
+                  <a:graphicData uri="http://schemas.microsoft.com/office/word/2010/wordprocessingShape">
+                    <wps:wsp>
+                      <wps:cNvSpPr/>
+                      <wps:spPr>
+                        <a:xfrm>
+                          <a:off x="0" y="0"/>
+                          <a:ext cx="6027420" cy="228600"/>
+                        </a:xfrm>
+                        <a:prstGeom prst="rect">
+                          <a:avLst/>
+                        </a:prstGeom>
+                        <a:noFill/>
+                        <a:ln>
+                          <a:solidFill>
+                            <a:schemeClr val="bg1"/>
+                          </a:solidFill>
+                        </a:ln>
+                      </wps:spPr>
+                      <wps:style>
+                        <a:lnRef idx="2">
+                          <a:schemeClr val="accent6"/>
+                        </a:lnRef>
+                        <a:fillRef idx="1">
+                          <a:schemeClr val="lt1"/>
+                        </a:fillRef>
+                        <a:effectRef idx="0">
+                          <a:schemeClr val="accent6"/>
+                        </a:effectRef>
+                        <a:fontRef idx="minor">
+                          <a:schemeClr val="dk1"/>
+                        </a:fontRef>
+                      </wps:style>
+                      <wps:txbx>
+                        <w:txbxContent>
+                          <w:p>
+                            <w:pPr>
+                              <w:jc w:val="center"/>
+                              <w:rPr>
+                                <w:rFonts w:ascii="Times New Roman" w:hAnsi="Times New Roman" w:cs="Times New Roman"/>
+                                <w:color w:val="FFFFFF" w:themeColor="background1"/>
+                                <w:sz w:val="16"/>
+                                <w:szCs w:val="16"/>
+                              </w:rPr>
+                            </w:pPr>
+                            <w:r>
+                              <w:rPr>
+                                <w:rFonts w:ascii="Times New Roman" w:hAnsi="Times New Roman" w:cs="Times New Roman"/>
+                                <w:color w:val="FFFFFF" w:themeColor="background1"/>
+                                <w:sz w:val="16"/>
+                                <w:szCs w:val="16"/>
+                              </w:rPr>
+                              <w:t xml:space="preserve">Figure 1: </w:t>
+                            </w:r>
+                            <w:proofErr w:type="spellStart"/>
+                            <w:r>
+                              <w:rPr>
+                                <w:rFonts w:ascii="Times New Roman" w:hAnsi="Times New Roman" w:cs="Times New Roman"/>
+                                <w:color w:val="FFFFFF" w:themeColor="background1"/>
+                                <w:sz w:val="16"/>
+                                <w:szCs w:val="16"/>
+                              </w:rPr>
+                              <w:t>NightFall’s</w:t>
+                            </w:r>
+                            <w:proofErr w:type="spellEnd"/>
+                            <w:r>
+                              <w:rPr>
+                                <w:rFonts w:ascii="Times New Roman" w:hAnsi="Times New Roman" w:cs="Times New Roman"/>
+                                <w:color w:val="FFFFFF" w:themeColor="background1"/>
+                                <w:sz w:val="16"/>
+                                <w:szCs w:val="16"/>
+                              </w:rPr>
+                              <w:t xml:space="preserve"> Herald</w:t>
+                            </w:r>
+                          </w:p>
+                        </w:txbxContent>
+                      </wps:txbx>
+                      <wps:bodyPr rot="0" spcFirstLastPara="0" vertOverflow="overflow" horzOverflow="overflow" vert="horz" wrap="square" lIns="91440" tIns="45720" rIns="91440" bIns="45720" numCol="1" spcCol="0" rtlCol="0" fromWordArt="0" anchor="ctr" anchorCtr="0" forceAA="0" compatLnSpc="1">
+                        <a:prstTxWarp prst="textNoShape">
+                          <a:avLst/>
+                        </a:prstTxWarp>
+                        <a:noAutofit/>
+                      </wps:bodyPr>
+                    </wps:wsp>
+                  </a:graphicData>
+                </a:graphic>
+                <wp14:sizeRelH relativeFrom="margin">
+                  <wp14:pctWidth>0</wp14:pctWidth>
+                </wp14:sizeRelH>
+                <wp14:sizeRelV relativeFrom="margin">
+                  <wp14:pctHeight>0</wp14:pctHeight>
+                </wp14:sizeRelV>
+              </wp:anchor>
+            </w:drawing>
+          </mc:Choice>
+          <mc:Fallback>
+            <w:pict>
+              <v:rect w14:anchorId="2932DED4" id="Rectangle 1" o:spid="_x0000_s1026" style="position:absolute;left:0;text-align:left;margin-left:0;margin-top:246pt;width:474.6pt;height:18pt;z-index:251659264;visibility:visible;mso-wrap-style:square;mso-width-percent:0;mso-height-percent:0;mso-wrap-distance-left:9pt;mso-wrap-distance-top:0;mso-wrap-distance-right:9pt;mso-wrap-distance-bottom:0;mso-position-horizontal:left;mso-position-horizontal-relative:margin;mso-position-vertical:absolute;mso-position-vertical-relative:text;mso-width-percent:0;mso-height-percent:0;mso-width-relative:margin;mso-height-relative:margin;v-text-anchor:middle" o:gfxdata="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" filled="f" strokecolor="white [3212]" strokeweight="1pt">
+                <v:textbox>
+                  <w:txbxContent>
+                    <w:p>
+                      <w:pPr>
+                        <w:jc w:val="center"/>
+                        <w:rPr>
+                          <w:rFonts w:ascii="Times New Roman" w:hAnsi="Times New Roman" w:cs="Times New Roman"/>
+                          <w:color w:val="FFFFFF" w:themeColor="background1"/>
+                          <w:sz w:val="16"/>
+                          <w:szCs w:val="16"/>
+                        </w:rPr>
+                      </w:pPr>
+                      <w:r>
+                        <w:rPr>
+                          <w:rFonts w:ascii="Times New Roman" w:hAnsi="Times New Roman" w:cs="Times New Roman"/>
+                          <w:color w:val="FFFFFF" w:themeColor="background1"/>
+                          <w:sz w:val="16"/>
+                          <w:szCs w:val="16"/>
+                        </w:rPr>
+                        <w:t xml:space="preserve">Figure 1: </w:t>
+                      </w:r>
+                      <w:proofErr w:type="spellStart"/>
+                      <w:r>
+                        <w:rPr>
+                          <w:rFonts w:ascii="Times New Roman" w:hAnsi="Times New Roman" w:cs="Times New Roman"/>
+                          <w:color w:val="FFFFFF" w:themeColor="background1"/>
+                          <w:sz w:val="16"/>
+                          <w:szCs w:val="16"/>
+                        </w:rPr>
+                        <w:t>NightFall’s</w:t>
+                      </w:r>
+                      <w:proofErr w:type="spellEnd"/>
+                      <w:r>
+                        <w:rPr>
+                          <w:rFonts w:ascii="Times New Roman" w:hAnsi="Times New Roman" w:cs="Times New Roman"/>
+                          <w:color w:val="FFFFFF" w:themeColor="background1"/>
+                          <w:sz w:val="16"/>
+                          <w:szCs w:val="16"/>
+                        </w:rPr>
+                        <w:t xml:space="preserve"> Herald</w:t>
+                      </w:r>
+                    </w:p>
+                  </w:txbxContent>
+                </v:textbox>
+                <w10:wrap anchorx="margin"/>
+              </v:rect>
+            </w:pict>
+          </mc:Fallback>
+        </mc:AlternateContent>
+      </w:r>
+      <w:r>
+        <w:rPr>
+          <w:rFonts w:ascii="Times New Roman" w:hAnsi="Times New Roman" w:cs="Times New Roman"/>
+          <w:b/>
+          <w:bCs/>
+          <w:noProof/>
+          <w:sz w:val="28"/>
+          <w:szCs w:val="28"/>
+        </w:rPr>
+        <w:drawing>
+          <wp:inline distT="0" distB="0" distL="0" distR="0" wp14:anchorId="3F5471A7" wp14:editId="1DB04126">
+            <wp:extent cx="5980411" cy="3360420"/>
+            <wp:effectExtent l="0" t="0" r="1905" b="0"/>
+            <wp:docPr id="1248870735" name="Picture 77" descr="A bat head and balls on a chessboard&#10;&#10;AI-generated content may be incorrect."/>
+            <wp:cNvGraphicFramePr>
+              <a:graphicFrameLocks xmlns:a="http://schemas.openxmlformats.org/drawingml/2006/main" noChangeAspect="1"/>
+            </wp:cNvGraphicFramePr>
+            <a:graphic xmlns:a="http://schemas.openxmlformats.org/drawingml/2006/main">
+              <a:graphicData uri="http://schemas.openxmlformats.org/drawingml/2006/picture">
+                <pic:pic xmlns:pic="http://schemas.openxmlformats.org/drawingml/2006/picture">
+                  <pic:nvPicPr>
+                    <pic:cNvPr id="1248870735" name="Picture 77" descr="A bat head and balls on a chessboard&#10;&#10;AI-generated content may be incorrect."/>
+                    <pic:cNvPicPr>
+                      <a:picLocks noChangeAspect="1" noChangeArrowheads="1"/>
+                    </pic:cNvPicPr>
+                  </pic:nvPicPr>
+                  <pic:blipFill>
+                    <a:blip r:embed="rId6" cstate="print">
+                      <a:extLst>
+                        <a:ext uri="{28A0092B-C50C-407E-A947-70E740481C1C}">
+                          <a14:useLocalDpi xmlns:a14="http://schemas.microsoft.com/office/drawing/2010/main" val="0"/>
+                        </a:ext>
+                      </a:extLst>
+                    </a:blip>
+                    <a:srcRect/>
+                    <a:stretch>
+                      <a:fillRect/>
+                    </a:stretch>
+                  </pic:blipFill>
+                  <pic:spPr bwMode="auto">
+                    <a:xfrm>
+                      <a:off x="0" y="0"/>
+                      <a:ext cx="6054672" cy="3402147"/>
+                    </a:xfrm>
+                    <a:prstGeom prst="rect">
+                      <a:avLst/>
+                    </a:prstGeom>
+                    <a:noFill/>
+                    <a:ln>
+                      <a:noFill/>
+                    </a:ln>
+                  </pic:spPr>
+                </pic:pic>
+              </a:graphicData>
+            </a:graphic>
+          </wp:inline>
+        </w:drawing>
+      </w:r>
+    </w:p>
+    <w:p>
+      <w:pPr>
+        <w:jc w:val="center"/>
+        <w:rPr>
+          <w:rFonts w:ascii="Times New Roman" w:hAnsi="Times New Roman" w:cs="Times New Roman"/>
+          <w:sz w:val="32"/>
+          <w:szCs w:val="32"/>
+        </w:rPr>
+      </w:pPr>
+      <w:r>
+        <w:rPr>
+          <w:rFonts w:ascii="Times New Roman" w:hAnsi="Times New Roman" w:cs="Times New Roman"/>
+          <w:b/>
+          <w:bCs/>
+          <w:sz w:val="32"/>
+          <w:szCs w:val="32"/>
+          <w:u w:val="single"/>
+        </w:rPr>
         <w:t>Implementation of a Ray Tracer</w:t>
       </w:r>
     </w:p>
@@ -30,7 +274,7 @@
           <w:rFonts w:ascii="Times New Roman" w:hAnsi="Times New Roman" w:cs="Times New Roman"/>
         </w:rPr>
         <w:sectPr>
-          <w:footerReference w:type="default" r:id="rId6"/>
+          <w:footerReference w:type="default" r:id="rId7"/>
           <w:pgSz w:w="12240" w:h="15840"/>
           <w:pgMar w:top="1440" w:right="1440" w:bottom="1440" w:left="1440" w:header="144" w:footer="144" w:gutter="0"/>
           <w:cols w:space="720"/>
@@ -139,13 +383,7 @@
           <w:i/>
           <w:iCs/>
         </w:rPr>
-        <w:t xml:space="preserve"> Ray Tracing: The Next Week</w:t>
-      </w:r>
-      <w:r>
-        <w:rPr>
-          <w:rFonts w:ascii="Times New Roman" w:hAnsi="Times New Roman" w:cs="Times New Roman"/>
-        </w:rPr>
-        <w:t xml:space="preserve"> [2] and even more capabilities inspired by in-class discussion and topics covered in </w:t>
+        <w:t xml:space="preserve"> Ray Tracing: </w:t>
       </w:r>
       <w:r>
         <w:rPr>
@@ -153,13 +391,13 @@
           <w:i/>
           <w:iCs/>
         </w:rPr>
-        <w:t>Ray Tracing: The Rest of Your Life</w:t>
-      </w:r>
-      <w:r>
-        <w:rPr>
-          <w:rFonts w:ascii="Times New Roman" w:hAnsi="Times New Roman" w:cs="Times New Roman"/>
-        </w:rPr>
-        <w:t xml:space="preserve"> [3] and </w:t>
+        <w:t>The Next Week</w:t>
+      </w:r>
+      <w:r>
+        <w:rPr>
+          <w:rFonts w:ascii="Times New Roman" w:hAnsi="Times New Roman" w:cs="Times New Roman"/>
+        </w:rPr>
+        <w:t xml:space="preserve"> [2] and even more capabilities inspired by in-class discussion and topics covered in </w:t>
       </w:r>
       <w:r>
         <w:rPr>
@@ -167,24 +405,38 @@
           <w:i/>
           <w:iCs/>
         </w:rPr>
-        <w:t xml:space="preserve">Physically Based Rendering: From Theory </w:t>
-      </w:r>
-      <w:proofErr w:type="gramStart"/>
+        <w:t>Ray Tracing: The Rest of Your Life</w:t>
+      </w:r>
+      <w:r>
+        <w:rPr>
+          <w:rFonts w:ascii="Times New Roman" w:hAnsi="Times New Roman" w:cs="Times New Roman"/>
+        </w:rPr>
+        <w:t xml:space="preserve"> [3] and </w:t>
+      </w:r>
       <w:r>
         <w:rPr>
           <w:rFonts w:ascii="Times New Roman" w:hAnsi="Times New Roman" w:cs="Times New Roman"/>
           <w:i/>
           <w:iCs/>
         </w:rPr>
-        <w:t>To</w:t>
-      </w:r>
-      <w:proofErr w:type="gramEnd"/>
+        <w:t xml:space="preserve">Physically Based Rendering: From Theory </w:t>
+      </w:r>
+      <w:proofErr w:type="gramStart"/>
       <w:r>
         <w:rPr>
           <w:rFonts w:ascii="Times New Roman" w:hAnsi="Times New Roman" w:cs="Times New Roman"/>
           <w:i/>
           <w:iCs/>
         </w:rPr>
+        <w:t>To</w:t>
+      </w:r>
+      <w:proofErr w:type="gramEnd"/>
+      <w:r>
+        <w:rPr>
+          <w:rFonts w:ascii="Times New Roman" w:hAnsi="Times New Roman" w:cs="Times New Roman"/>
+          <w:i/>
+          <w:iCs/>
+        </w:rPr>
         <w:t xml:space="preserve"> Implementation</w:t>
       </w:r>
       <w:r>
@@ -225,9 +477,11 @@
           <w:sz w:val="28"/>
           <w:szCs w:val="28"/>
         </w:rPr>
-        <w:br w:type="column"/>
-      </w:r>
-      <w:r>
+        <w:br w:type="page"/>
+      </w:r>
+    </w:p>
+    <w:p>
+      <w:pPr>
         <w:rPr>
           <w:rFonts w:ascii="Times New Roman" w:hAnsi="Times New Roman" w:cs="Times New Roman"/>
           <w:b/>
@@ -235,6 +489,16 @@
           <w:sz w:val="28"/>
           <w:szCs w:val="28"/>
         </w:rPr>
+      </w:pPr>
+      <w:r>
+        <w:rPr>
+          <w:rFonts w:ascii="Times New Roman" w:hAnsi="Times New Roman" w:cs="Times New Roman"/>
+          <w:b/>
+          <w:bCs/>
+          <w:sz w:val="28"/>
+          <w:szCs w:val="28"/>
+        </w:rPr>
+        <w:lastRenderedPageBreak/>
         <w:t>Core Rendering System:</w:t>
       </w:r>
     </w:p>
@@ -275,6 +539,157 @@
           <w:rFonts w:ascii="Times New Roman" w:hAnsi="Times New Roman" w:cs="Times New Roman"/>
         </w:rPr>
       </w:pPr>
+      <w:r>
+        <w:rPr>
+          <w:rFonts w:ascii="Times New Roman" w:hAnsi="Times New Roman" w:cs="Times New Roman"/>
+          <w:b/>
+          <w:bCs/>
+          <w:noProof/>
+          <w:sz w:val="28"/>
+          <w:szCs w:val="28"/>
+        </w:rPr>
+        <mc:AlternateContent>
+          <mc:Choice Requires="wps">
+            <w:drawing>
+              <wp:anchor distT="0" distB="0" distL="114300" distR="114300" simplePos="0" relativeHeight="251661312" behindDoc="0" locked="0" layoutInCell="1" allowOverlap="1" wp14:anchorId="610C7284" wp14:editId="665AC878">
+                <wp:simplePos x="0" y="0"/>
+                <wp:positionH relativeFrom="margin">
+                  <wp:posOffset>121920</wp:posOffset>
+                </wp:positionH>
+                <wp:positionV relativeFrom="paragraph">
+                  <wp:posOffset>1313815</wp:posOffset>
+                </wp:positionV>
+                <wp:extent cx="2956560" cy="274320"/>
+                <wp:effectExtent l="0" t="0" r="15240" b="11430"/>
+                <wp:wrapNone/>
+                <wp:docPr id="1941507562" name="Rectangle 1"/>
+                <wp:cNvGraphicFramePr/>
+                <a:graphic xmlns:a="http://schemas.openxmlformats.org/drawingml/2006/main">
+                  <a:graphicData uri="http://schemas.microsoft.com/office/word/2010/wordprocessingShape">
+                    <wps:wsp>
+                      <wps:cNvSpPr/>
+                      <wps:spPr>
+                        <a:xfrm>
+                          <a:off x="0" y="0"/>
+                          <a:ext cx="2956560" cy="274320"/>
+                        </a:xfrm>
+                        <a:prstGeom prst="rect">
+                          <a:avLst/>
+                        </a:prstGeom>
+                        <a:noFill/>
+                        <a:ln>
+                          <a:solidFill>
+                            <a:schemeClr val="bg1"/>
+                          </a:solidFill>
+                        </a:ln>
+                      </wps:spPr>
+                      <wps:style>
+                        <a:lnRef idx="2">
+                          <a:schemeClr val="accent6"/>
+                        </a:lnRef>
+                        <a:fillRef idx="1">
+                          <a:schemeClr val="lt1"/>
+                        </a:fillRef>
+                        <a:effectRef idx="0">
+                          <a:schemeClr val="accent6"/>
+                        </a:effectRef>
+                        <a:fontRef idx="minor">
+                          <a:schemeClr val="dk1"/>
+                        </a:fontRef>
+                      </wps:style>
+                      <wps:txbx>
+                        <w:txbxContent>
+                          <w:p>
+                            <w:pPr>
+                              <w:rPr>
+                                <w:rFonts w:ascii="Times New Roman" w:hAnsi="Times New Roman" w:cs="Times New Roman"/>
+                                <w:color w:val="000000" w:themeColor="text1"/>
+                                <w:sz w:val="16"/>
+                                <w:szCs w:val="16"/>
+                              </w:rPr>
+                            </w:pPr>
+                            <w:r>
+                              <w:rPr>
+                                <w:rFonts w:ascii="Times New Roman" w:hAnsi="Times New Roman" w:cs="Times New Roman"/>
+                                <w:color w:val="000000" w:themeColor="text1"/>
+                                <w:sz w:val="16"/>
+                                <w:szCs w:val="16"/>
+                              </w:rPr>
+                              <w:t xml:space="preserve">   Figure 2: Ball</w:t>
+                            </w:r>
+                            <w:r>
+                              <w:rPr>
+                                <w:rFonts w:ascii="Times New Roman" w:hAnsi="Times New Roman" w:cs="Times New Roman"/>
+                                <w:color w:val="000000" w:themeColor="text1"/>
+                                <w:sz w:val="16"/>
+                                <w:szCs w:val="16"/>
+                              </w:rPr>
+                              <w:tab/>
+                              <w:t>Figure 3: Triangle Test   Figure 4: Quads 101</w:t>
+                            </w:r>
+                          </w:p>
+                        </w:txbxContent>
+                      </wps:txbx>
+                      <wps:bodyPr rot="0" spcFirstLastPara="0" vertOverflow="overflow" horzOverflow="overflow" vert="horz" wrap="square" lIns="91440" tIns="45720" rIns="91440" bIns="45720" numCol="1" spcCol="0" rtlCol="0" fromWordArt="0" anchor="ctr" anchorCtr="0" forceAA="0" compatLnSpc="1">
+                        <a:prstTxWarp prst="textNoShape">
+                          <a:avLst/>
+                        </a:prstTxWarp>
+                        <a:noAutofit/>
+                      </wps:bodyPr>
+                    </wps:wsp>
+                  </a:graphicData>
+                </a:graphic>
+                <wp14:sizeRelH relativeFrom="margin">
+                  <wp14:pctWidth>0</wp14:pctWidth>
+                </wp14:sizeRelH>
+                <wp14:sizeRelV relativeFrom="margin">
+                  <wp14:pctHeight>0</wp14:pctHeight>
+                </wp14:sizeRelV>
+              </wp:anchor>
+            </w:drawing>
+          </mc:Choice>
+          <mc:Fallback>
+            <w:pict>
+              <v:rect w14:anchorId="610C7284" id="_x0000_s1027" style="position:absolute;left:0;text-align:left;margin-left:9.6pt;margin-top:103.45pt;width:232.8pt;height:21.6pt;z-index:251661312;visibility:visible;mso-wrap-style:square;mso-width-percent:0;mso-height-percent:0;mso-wrap-distance-left:9pt;mso-wrap-distance-top:0;mso-wrap-distance-right:9pt;mso-wrap-distance-bottom:0;mso-position-horizontal:absolute;mso-position-horizontal-relative:margin;mso-position-vertical:absolute;mso-position-vertical-relative:text;mso-width-percent:0;mso-height-percent:0;mso-width-relative:margin;mso-height-relative:margin;v-text-anchor:middle" o:gfxdata="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" filled="f" strokecolor="white [3212]" strokeweight="1pt">
+                <v:textbox>
+                  <w:txbxContent>
+                    <w:p>
+                      <w:pPr>
+                        <w:rPr>
+                          <w:rFonts w:ascii="Times New Roman" w:hAnsi="Times New Roman" w:cs="Times New Roman"/>
+                          <w:color w:val="000000" w:themeColor="text1"/>
+                          <w:sz w:val="16"/>
+                          <w:szCs w:val="16"/>
+                        </w:rPr>
+                      </w:pPr>
+                      <w:r>
+                        <w:rPr>
+                          <w:rFonts w:ascii="Times New Roman" w:hAnsi="Times New Roman" w:cs="Times New Roman"/>
+                          <w:color w:val="000000" w:themeColor="text1"/>
+                          <w:sz w:val="16"/>
+                          <w:szCs w:val="16"/>
+                        </w:rPr>
+                        <w:t xml:space="preserve">   Figure 2: Ball</w:t>
+                      </w:r>
+                      <w:r>
+                        <w:rPr>
+                          <w:rFonts w:ascii="Times New Roman" w:hAnsi="Times New Roman" w:cs="Times New Roman"/>
+                          <w:color w:val="000000" w:themeColor="text1"/>
+                          <w:sz w:val="16"/>
+                          <w:szCs w:val="16"/>
+                        </w:rPr>
+                        <w:tab/>
+                        <w:t>Figure 3: Triangle Test   Figure 4: Quads 101</w:t>
+                      </w:r>
+                    </w:p>
+                  </w:txbxContent>
+                </v:textbox>
+                <w10:wrap anchorx="margin"/>
+              </v:rect>
+            </w:pict>
+          </mc:Fallback>
+        </mc:AlternateContent>
+      </w:r>
       <w:r>
         <w:rPr>
           <w:b/>
@@ -301,7 +716,7 @@
                     </pic:cNvPicPr>
                   </pic:nvPicPr>
                   <pic:blipFill rotWithShape="1">
-                    <a:blip r:embed="rId7">
+                    <a:blip r:embed="rId8">
                       <a:extLst>
                         <a:ext uri="{28A0092B-C50C-407E-A947-70E740481C1C}">
                           <a14:useLocalDpi xmlns:a14="http://schemas.microsoft.com/office/drawing/2010/main" val="0"/>
@@ -363,7 +778,7 @@
                     </pic:cNvPicPr>
                   </pic:nvPicPr>
                   <pic:blipFill rotWithShape="1">
-                    <a:blip r:embed="rId8">
+                    <a:blip r:embed="rId9">
                       <a:extLst>
                         <a:ext uri="{28A0092B-C50C-407E-A947-70E740481C1C}">
                           <a14:useLocalDpi xmlns:a14="http://schemas.microsoft.com/office/drawing/2010/main" val="0"/>
@@ -425,7 +840,7 @@
                     </pic:cNvPicPr>
                   </pic:nvPicPr>
                   <pic:blipFill rotWithShape="1">
-                    <a:blip r:embed="rId9" cstate="print">
+                    <a:blip r:embed="rId10" cstate="print">
                       <a:extLst>
                         <a:ext uri="{28A0092B-C50C-407E-A947-70E740481C1C}">
                           <a14:useLocalDpi xmlns:a14="http://schemas.microsoft.com/office/drawing/2010/main" val="0"/>
@@ -464,6 +879,7 @@
     </w:p>
     <w:p>
       <w:pPr>
+        <w:spacing w:before="360"/>
         <w:rPr>
           <w:rFonts w:ascii="Times New Roman" w:hAnsi="Times New Roman" w:cs="Times New Roman"/>
         </w:rPr>
@@ -498,6 +914,157 @@
           <w:bCs/>
         </w:rPr>
       </w:pPr>
+      <w:r>
+        <w:rPr>
+          <w:rFonts w:ascii="Times New Roman" w:hAnsi="Times New Roman" w:cs="Times New Roman"/>
+          <w:b/>
+          <w:bCs/>
+          <w:noProof/>
+          <w:sz w:val="28"/>
+          <w:szCs w:val="28"/>
+        </w:rPr>
+        <mc:AlternateContent>
+          <mc:Choice Requires="wps">
+            <w:drawing>
+              <wp:anchor distT="0" distB="0" distL="114300" distR="114300" simplePos="0" relativeHeight="251663360" behindDoc="0" locked="0" layoutInCell="1" allowOverlap="1" wp14:anchorId="1E851F83" wp14:editId="5C6C10A9">
+                <wp:simplePos x="0" y="0"/>
+                <wp:positionH relativeFrom="margin">
+                  <wp:align>left</wp:align>
+                </wp:positionH>
+                <wp:positionV relativeFrom="paragraph">
+                  <wp:posOffset>3332480</wp:posOffset>
+                </wp:positionV>
+                <wp:extent cx="3368040" cy="281940"/>
+                <wp:effectExtent l="0" t="0" r="22860" b="22860"/>
+                <wp:wrapNone/>
+                <wp:docPr id="742284394" name="Rectangle 1"/>
+                <wp:cNvGraphicFramePr/>
+                <a:graphic xmlns:a="http://schemas.openxmlformats.org/drawingml/2006/main">
+                  <a:graphicData uri="http://schemas.microsoft.com/office/word/2010/wordprocessingShape">
+                    <wps:wsp>
+                      <wps:cNvSpPr/>
+                      <wps:spPr>
+                        <a:xfrm>
+                          <a:off x="0" y="0"/>
+                          <a:ext cx="3368040" cy="281940"/>
+                        </a:xfrm>
+                        <a:prstGeom prst="rect">
+                          <a:avLst/>
+                        </a:prstGeom>
+                        <a:noFill/>
+                        <a:ln>
+                          <a:solidFill>
+                            <a:schemeClr val="bg1"/>
+                          </a:solidFill>
+                        </a:ln>
+                      </wps:spPr>
+                      <wps:style>
+                        <a:lnRef idx="2">
+                          <a:schemeClr val="accent6"/>
+                        </a:lnRef>
+                        <a:fillRef idx="1">
+                          <a:schemeClr val="lt1"/>
+                        </a:fillRef>
+                        <a:effectRef idx="0">
+                          <a:schemeClr val="accent6"/>
+                        </a:effectRef>
+                        <a:fontRef idx="minor">
+                          <a:schemeClr val="dk1"/>
+                        </a:fontRef>
+                      </wps:style>
+                      <wps:txbx>
+                        <w:txbxContent>
+                          <w:p>
+                            <w:pPr>
+                              <w:jc w:val="center"/>
+                              <w:rPr>
+                                <w:rFonts w:ascii="Times New Roman" w:hAnsi="Times New Roman" w:cs="Times New Roman"/>
+                                <w:color w:val="000000" w:themeColor="text1"/>
+                                <w:sz w:val="16"/>
+                                <w:szCs w:val="16"/>
+                              </w:rPr>
+                            </w:pPr>
+                            <w:r>
+                              <w:rPr>
+                                <w:rFonts w:ascii="Times New Roman" w:hAnsi="Times New Roman" w:cs="Times New Roman"/>
+                                <w:color w:val="000000" w:themeColor="text1"/>
+                                <w:sz w:val="16"/>
+                                <w:szCs w:val="16"/>
+                              </w:rPr>
+                              <w:t xml:space="preserve">Figure </w:t>
+                            </w:r>
+                            <w:r>
+                              <w:rPr>
+                                <w:rFonts w:ascii="Times New Roman" w:hAnsi="Times New Roman" w:cs="Times New Roman"/>
+                                <w:color w:val="000000" w:themeColor="text1"/>
+                                <w:sz w:val="16"/>
+                                <w:szCs w:val="16"/>
+                              </w:rPr>
+                              <w:t>5: Cornell Bat</w:t>
+                            </w:r>
+                          </w:p>
+                        </w:txbxContent>
+                      </wps:txbx>
+                      <wps:bodyPr rot="0" spcFirstLastPara="0" vertOverflow="overflow" horzOverflow="overflow" vert="horz" wrap="square" lIns="91440" tIns="45720" rIns="91440" bIns="45720" numCol="1" spcCol="0" rtlCol="0" fromWordArt="0" anchor="ctr" anchorCtr="0" forceAA="0" compatLnSpc="1">
+                        <a:prstTxWarp prst="textNoShape">
+                          <a:avLst/>
+                        </a:prstTxWarp>
+                        <a:noAutofit/>
+                      </wps:bodyPr>
+                    </wps:wsp>
+                  </a:graphicData>
+                </a:graphic>
+                <wp14:sizeRelH relativeFrom="margin">
+                  <wp14:pctWidth>0</wp14:pctWidth>
+                </wp14:sizeRelH>
+                <wp14:sizeRelV relativeFrom="margin">
+                  <wp14:pctHeight>0</wp14:pctHeight>
+                </wp14:sizeRelV>
+              </wp:anchor>
+            </w:drawing>
+          </mc:Choice>
+          <mc:Fallback>
+            <w:pict>
+              <v:rect w14:anchorId="1E851F83" id="_x0000_s1028" style="position:absolute;left:0;text-align:left;margin-left:0;margin-top:262.4pt;width:265.2pt;height:22.2pt;z-index:251663360;visibility:visible;mso-wrap-style:square;mso-width-percent:0;mso-height-percent:0;mso-wrap-distance-left:9pt;mso-wrap-distance-top:0;mso-wrap-distance-right:9pt;mso-wrap-distance-bottom:0;mso-position-horizontal:left;mso-position-horizontal-relative:margin;mso-position-vertical:absolute;mso-position-vertical-relative:text;mso-width-percent:0;mso-height-percent:0;mso-width-relative:margin;mso-height-relative:margin;v-text-anchor:middle" o:gfxdata="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" filled="f" strokecolor="white [3212]" strokeweight="1pt">
+                <v:textbox>
+                  <w:txbxContent>
+                    <w:p>
+                      <w:pPr>
+                        <w:jc w:val="center"/>
+                        <w:rPr>
+                          <w:rFonts w:ascii="Times New Roman" w:hAnsi="Times New Roman" w:cs="Times New Roman"/>
+                          <w:color w:val="000000" w:themeColor="text1"/>
+                          <w:sz w:val="16"/>
+                          <w:szCs w:val="16"/>
+                        </w:rPr>
+                      </w:pPr>
+                      <w:r>
+                        <w:rPr>
+                          <w:rFonts w:ascii="Times New Roman" w:hAnsi="Times New Roman" w:cs="Times New Roman"/>
+                          <w:color w:val="000000" w:themeColor="text1"/>
+                          <w:sz w:val="16"/>
+                          <w:szCs w:val="16"/>
+                        </w:rPr>
+                        <w:t xml:space="preserve">Figure </w:t>
+                      </w:r>
+                      <w:r>
+                        <w:rPr>
+                          <w:rFonts w:ascii="Times New Roman" w:hAnsi="Times New Roman" w:cs="Times New Roman"/>
+                          <w:color w:val="000000" w:themeColor="text1"/>
+                          <w:sz w:val="16"/>
+                          <w:szCs w:val="16"/>
+                        </w:rPr>
+                        <w:t>5: Cornell Bat</w:t>
+                      </w:r>
+                    </w:p>
+                  </w:txbxContent>
+                </v:textbox>
+                <w10:wrap anchorx="margin"/>
+              </v:rect>
+            </w:pict>
+          </mc:Fallback>
+        </mc:AlternateContent>
+      </w:r>
       <w:r>
         <w:rPr>
           <w:b/>
@@ -507,9 +1074,9 @@
           <w:bdr w:val="none" w:sz="0" w:space="0" w:color="auto" w:frame="1"/>
         </w:rPr>
         <w:drawing>
-          <wp:inline distT="0" distB="0" distL="0" distR="0" wp14:anchorId="0D82150D" wp14:editId="4B7E0A10">
-            <wp:extent cx="3002280" cy="3002280"/>
-            <wp:effectExtent l="0" t="0" r="7620" b="7620"/>
+          <wp:inline distT="0" distB="0" distL="0" distR="0" wp14:anchorId="0D82150D" wp14:editId="583C48C3">
+            <wp:extent cx="3329940" cy="3329940"/>
+            <wp:effectExtent l="0" t="0" r="3810" b="3810"/>
             <wp:docPr id="966190214" name="Picture 52" descr="A group of bats from a wall&#10;&#10;AI-generated content may be incorrect."/>
             <wp:cNvGraphicFramePr>
               <a:graphicFrameLocks xmlns:a="http://schemas.openxmlformats.org/drawingml/2006/main" noChangeAspect="1"/>
@@ -524,7 +1091,7 @@
                     </pic:cNvPicPr>
                   </pic:nvPicPr>
                   <pic:blipFill>
-                    <a:blip r:embed="rId10">
+                    <a:blip r:embed="rId11">
                       <a:extLst>
                         <a:ext uri="{28A0092B-C50C-407E-A947-70E740481C1C}">
                           <a14:useLocalDpi xmlns:a14="http://schemas.microsoft.com/office/drawing/2010/main" val="0"/>
@@ -539,7 +1106,7 @@
                   <pic:spPr bwMode="auto">
                     <a:xfrm>
                       <a:off x="0" y="0"/>
-                      <a:ext cx="3002280" cy="3002280"/>
+                      <a:ext cx="3329940" cy="3329940"/>
                     </a:xfrm>
                     <a:prstGeom prst="rect">
                       <a:avLst/>
@@ -570,7 +1137,14 @@
           <w:b/>
           <w:bCs/>
         </w:rPr>
-        <w:lastRenderedPageBreak/>
+        <w:br w:type="column"/>
+      </w:r>
+      <w:r>
+        <w:rPr>
+          <w:rFonts w:ascii="Times New Roman" w:hAnsi="Times New Roman" w:cs="Times New Roman"/>
+          <w:b/>
+          <w:bCs/>
+        </w:rPr>
         <w:t>Camera System:</w:t>
       </w:r>
     </w:p>
@@ -660,7 +1234,13 @@
         <w:rPr>
           <w:rFonts w:ascii="Times New Roman" w:hAnsi="Times New Roman" w:cs="Times New Roman"/>
         </w:rPr>
-        <w:t>a color</w:t>
+        <w:t xml:space="preserve">a </w:t>
+      </w:r>
+      <w:r>
+        <w:rPr>
+          <w:rFonts w:ascii="Times New Roman" w:hAnsi="Times New Roman" w:cs="Times New Roman"/>
+        </w:rPr>
+        <w:t>color</w:t>
       </w:r>
       <w:proofErr w:type="gramEnd"/>
       <w:r>
@@ -695,6 +1275,138 @@
           <w:szCs w:val="28"/>
         </w:rPr>
       </w:pPr>
+      <w:r>
+        <w:rPr>
+          <w:rFonts w:ascii="Times New Roman" w:hAnsi="Times New Roman" w:cs="Times New Roman"/>
+          <w:b/>
+          <w:bCs/>
+          <w:noProof/>
+          <w:sz w:val="28"/>
+          <w:szCs w:val="28"/>
+        </w:rPr>
+        <mc:AlternateContent>
+          <mc:Choice Requires="wps">
+            <w:drawing>
+              <wp:anchor distT="0" distB="0" distL="114300" distR="114300" simplePos="0" relativeHeight="251665408" behindDoc="0" locked="0" layoutInCell="1" allowOverlap="1" wp14:anchorId="59A7A8BF" wp14:editId="7DDD94DF">
+                <wp:simplePos x="0" y="0"/>
+                <wp:positionH relativeFrom="column">
+                  <wp:align>left</wp:align>
+                </wp:positionH>
+                <wp:positionV relativeFrom="paragraph">
+                  <wp:posOffset>1687195</wp:posOffset>
+                </wp:positionV>
+                <wp:extent cx="3192780" cy="213360"/>
+                <wp:effectExtent l="0" t="0" r="26670" b="15240"/>
+                <wp:wrapNone/>
+                <wp:docPr id="1762145117" name="Rectangle 1"/>
+                <wp:cNvGraphicFramePr/>
+                <a:graphic xmlns:a="http://schemas.openxmlformats.org/drawingml/2006/main">
+                  <a:graphicData uri="http://schemas.microsoft.com/office/word/2010/wordprocessingShape">
+                    <wps:wsp>
+                      <wps:cNvSpPr/>
+                      <wps:spPr>
+                        <a:xfrm>
+                          <a:off x="0" y="0"/>
+                          <a:ext cx="3192780" cy="213360"/>
+                        </a:xfrm>
+                        <a:prstGeom prst="rect">
+                          <a:avLst/>
+                        </a:prstGeom>
+                        <a:noFill/>
+                        <a:ln>
+                          <a:solidFill>
+                            <a:schemeClr val="bg1"/>
+                          </a:solidFill>
+                        </a:ln>
+                      </wps:spPr>
+                      <wps:style>
+                        <a:lnRef idx="2">
+                          <a:schemeClr val="accent6"/>
+                        </a:lnRef>
+                        <a:fillRef idx="1">
+                          <a:schemeClr val="lt1"/>
+                        </a:fillRef>
+                        <a:effectRef idx="0">
+                          <a:schemeClr val="accent6"/>
+                        </a:effectRef>
+                        <a:fontRef idx="minor">
+                          <a:schemeClr val="dk1"/>
+                        </a:fontRef>
+                      </wps:style>
+                      <wps:txbx>
+                        <w:txbxContent>
+                          <w:p>
+                            <w:pPr>
+                              <w:jc w:val="center"/>
+                              <w:rPr>
+                                <w:rFonts w:ascii="Times New Roman" w:hAnsi="Times New Roman" w:cs="Times New Roman"/>
+                                <w:color w:val="000000" w:themeColor="text1"/>
+                                <w:sz w:val="16"/>
+                                <w:szCs w:val="16"/>
+                              </w:rPr>
+                            </w:pPr>
+                            <w:r>
+                              <w:rPr>
+                                <w:rFonts w:ascii="Times New Roman" w:hAnsi="Times New Roman" w:cs="Times New Roman"/>
+                                <w:color w:val="000000" w:themeColor="text1"/>
+                                <w:sz w:val="16"/>
+                                <w:szCs w:val="16"/>
+                              </w:rPr>
+                              <w:t>Figure 6: Many Balls, Many Materials</w:t>
+                            </w:r>
+                          </w:p>
+                        </w:txbxContent>
+                      </wps:txbx>
+                      <wps:bodyPr rot="0" spcFirstLastPara="0" vertOverflow="overflow" horzOverflow="overflow" vert="horz" wrap="square" lIns="91440" tIns="45720" rIns="91440" bIns="45720" numCol="1" spcCol="0" rtlCol="0" fromWordArt="0" anchor="ctr" anchorCtr="0" forceAA="0" compatLnSpc="1">
+                        <a:prstTxWarp prst="textNoShape">
+                          <a:avLst/>
+                        </a:prstTxWarp>
+                        <a:noAutofit/>
+                      </wps:bodyPr>
+                    </wps:wsp>
+                  </a:graphicData>
+                </a:graphic>
+                <wp14:sizeRelH relativeFrom="margin">
+                  <wp14:pctWidth>0</wp14:pctWidth>
+                </wp14:sizeRelH>
+                <wp14:sizeRelV relativeFrom="margin">
+                  <wp14:pctHeight>0</wp14:pctHeight>
+                </wp14:sizeRelV>
+              </wp:anchor>
+            </w:drawing>
+          </mc:Choice>
+          <mc:Fallback>
+            <w:pict>
+              <v:rect w14:anchorId="59A7A8BF" id="_x0000_s1029" style="position:absolute;left:0;text-align:left;margin-left:0;margin-top:132.85pt;width:251.4pt;height:16.8pt;z-index:251665408;visibility:visible;mso-wrap-style:square;mso-width-percent:0;mso-height-percent:0;mso-wrap-distance-left:9pt;mso-wrap-distance-top:0;mso-wrap-distance-right:9pt;mso-wrap-distance-bottom:0;mso-position-horizontal:left;mso-position-horizontal-relative:text;mso-position-vertical:absolute;mso-position-vertical-relative:text;mso-width-percent:0;mso-height-percent:0;mso-width-relative:margin;mso-height-relative:margin;v-text-anchor:middle" o:gfxdata="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" filled="f" strokecolor="white [3212]" strokeweight="1pt">
+                <v:textbox>
+                  <w:txbxContent>
+                    <w:p>
+                      <w:pPr>
+                        <w:jc w:val="center"/>
+                        <w:rPr>
+                          <w:rFonts w:ascii="Times New Roman" w:hAnsi="Times New Roman" w:cs="Times New Roman"/>
+                          <w:color w:val="000000" w:themeColor="text1"/>
+                          <w:sz w:val="16"/>
+                          <w:szCs w:val="16"/>
+                        </w:rPr>
+                      </w:pPr>
+                      <w:r>
+                        <w:rPr>
+                          <w:rFonts w:ascii="Times New Roman" w:hAnsi="Times New Roman" w:cs="Times New Roman"/>
+                          <w:color w:val="000000" w:themeColor="text1"/>
+                          <w:sz w:val="16"/>
+                          <w:szCs w:val="16"/>
+                        </w:rPr>
+                        <w:t>Figure 6: Many Balls, Many Materials</w:t>
+                      </w:r>
+                    </w:p>
+                  </w:txbxContent>
+                </v:textbox>
+              </v:rect>
+            </w:pict>
+          </mc:Fallback>
+        </mc:AlternateContent>
+      </w:r>
       <w:r>
         <w:rPr>
           <w:b/>
@@ -721,7 +1433,7 @@
                     </pic:cNvPicPr>
                   </pic:nvPicPr>
                   <pic:blipFill>
-                    <a:blip r:embed="rId11" cstate="print">
+                    <a:blip r:embed="rId12" cstate="print">
                       <a:extLst>
                         <a:ext uri="{28A0092B-C50C-407E-A947-70E740481C1C}">
                           <a14:useLocalDpi xmlns:a14="http://schemas.microsoft.com/office/drawing/2010/main" val="0"/>
@@ -781,6 +1493,7 @@
           <w:sz w:val="28"/>
           <w:szCs w:val="28"/>
         </w:rPr>
+        <w:lastRenderedPageBreak/>
         <w:t>Advanced Rendering Features:</w:t>
       </w:r>
     </w:p>
@@ -877,6 +1590,156 @@
           <w:bCs/>
         </w:rPr>
       </w:pPr>
+      <w:r>
+        <w:rPr>
+          <w:rFonts w:ascii="Times New Roman" w:hAnsi="Times New Roman" w:cs="Times New Roman"/>
+          <w:b/>
+          <w:bCs/>
+          <w:noProof/>
+          <w:sz w:val="28"/>
+          <w:szCs w:val="28"/>
+        </w:rPr>
+        <mc:AlternateContent>
+          <mc:Choice Requires="wps">
+            <w:drawing>
+              <wp:anchor distT="0" distB="0" distL="114300" distR="114300" simplePos="0" relativeHeight="251667456" behindDoc="0" locked="0" layoutInCell="1" allowOverlap="1" wp14:anchorId="18C63E61" wp14:editId="2760E5B0">
+                <wp:simplePos x="0" y="0"/>
+                <wp:positionH relativeFrom="column">
+                  <wp:align>right</wp:align>
+                </wp:positionH>
+                <wp:positionV relativeFrom="paragraph">
+                  <wp:posOffset>1026795</wp:posOffset>
+                </wp:positionV>
+                <wp:extent cx="3185160" cy="236220"/>
+                <wp:effectExtent l="0" t="0" r="15240" b="11430"/>
+                <wp:wrapNone/>
+                <wp:docPr id="1144417802" name="Rectangle 1"/>
+                <wp:cNvGraphicFramePr/>
+                <a:graphic xmlns:a="http://schemas.openxmlformats.org/drawingml/2006/main">
+                  <a:graphicData uri="http://schemas.microsoft.com/office/word/2010/wordprocessingShape">
+                    <wps:wsp>
+                      <wps:cNvSpPr/>
+                      <wps:spPr>
+                        <a:xfrm>
+                          <a:off x="0" y="0"/>
+                          <a:ext cx="3185160" cy="236220"/>
+                        </a:xfrm>
+                        <a:prstGeom prst="rect">
+                          <a:avLst/>
+                        </a:prstGeom>
+                        <a:noFill/>
+                        <a:ln>
+                          <a:solidFill>
+                            <a:schemeClr val="bg1"/>
+                          </a:solidFill>
+                        </a:ln>
+                      </wps:spPr>
+                      <wps:style>
+                        <a:lnRef idx="2">
+                          <a:schemeClr val="accent6"/>
+                        </a:lnRef>
+                        <a:fillRef idx="1">
+                          <a:schemeClr val="lt1"/>
+                        </a:fillRef>
+                        <a:effectRef idx="0">
+                          <a:schemeClr val="accent6"/>
+                        </a:effectRef>
+                        <a:fontRef idx="minor">
+                          <a:schemeClr val="dk1"/>
+                        </a:fontRef>
+                      </wps:style>
+                      <wps:txbx>
+                        <w:txbxContent>
+                          <w:p>
+                            <w:pPr>
+                              <w:rPr>
+                                <w:rFonts w:ascii="Times New Roman" w:hAnsi="Times New Roman" w:cs="Times New Roman"/>
+                                <w:color w:val="000000" w:themeColor="text1"/>
+                                <w:sz w:val="16"/>
+                                <w:szCs w:val="16"/>
+                              </w:rPr>
+                            </w:pPr>
+                            <w:r>
+                              <w:rPr>
+                                <w:rFonts w:ascii="Times New Roman" w:hAnsi="Times New Roman" w:cs="Times New Roman"/>
+                                <w:color w:val="000000" w:themeColor="text1"/>
+                                <w:sz w:val="16"/>
+                                <w:szCs w:val="16"/>
+                              </w:rPr>
+                              <w:t>Figure 7: Perlin</w:t>
+                            </w:r>
+                            <w:r>
+                              <w:rPr>
+                                <w:rFonts w:ascii="Times New Roman" w:hAnsi="Times New Roman" w:cs="Times New Roman"/>
+                                <w:color w:val="000000" w:themeColor="text1"/>
+                                <w:sz w:val="16"/>
+                                <w:szCs w:val="16"/>
+                              </w:rPr>
+                              <w:tab/>
+                              <w:t xml:space="preserve">Figure 8: Image Texture       Figure 9: Checkered </w:t>
+                            </w:r>
+                          </w:p>
+                        </w:txbxContent>
+                      </wps:txbx>
+                      <wps:bodyPr rot="0" spcFirstLastPara="0" vertOverflow="overflow" horzOverflow="overflow" vert="horz" wrap="square" lIns="91440" tIns="45720" rIns="91440" bIns="45720" numCol="1" spcCol="0" rtlCol="0" fromWordArt="0" anchor="ctr" anchorCtr="0" forceAA="0" compatLnSpc="1">
+                        <a:prstTxWarp prst="textNoShape">
+                          <a:avLst/>
+                        </a:prstTxWarp>
+                        <a:noAutofit/>
+                      </wps:bodyPr>
+                    </wps:wsp>
+                  </a:graphicData>
+                </a:graphic>
+                <wp14:sizeRelH relativeFrom="margin">
+                  <wp14:pctWidth>0</wp14:pctWidth>
+                </wp14:sizeRelH>
+                <wp14:sizeRelV relativeFrom="margin">
+                  <wp14:pctHeight>0</wp14:pctHeight>
+                </wp14:sizeRelV>
+              </wp:anchor>
+            </w:drawing>
+          </mc:Choice>
+          <mc:Fallback>
+            <w:pict>
+              <v:rect w14:anchorId="18C63E61" id="_x0000_s1030" style="position:absolute;left:0;text-align:left;margin-left:199.6pt;margin-top:80.85pt;width:250.8pt;height:18.6pt;z-index:251667456;visibility:visible;mso-wrap-style:square;mso-width-percent:0;mso-height-percent:0;mso-wrap-distance-left:9pt;mso-wrap-distance-top:0;mso-wrap-distance-right:9pt;mso-wrap-distance-bottom:0;mso-position-horizontal:right;mso-position-horizontal-relative:text;mso-position-vertical:absolute;mso-position-vertical-relative:text;mso-width-percent:0;mso-height-percent:0;mso-width-relative:margin;mso-height-relative:margin;v-text-anchor:middle" o:gfxdata="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" filled="f" strokecolor="white [3212]" strokeweight="1pt">
+                <v:textbox>
+                  <w:txbxContent>
+                    <w:p>
+                      <w:pPr>
+                        <w:rPr>
+                          <w:rFonts w:ascii="Times New Roman" w:hAnsi="Times New Roman" w:cs="Times New Roman"/>
+                          <w:color w:val="000000" w:themeColor="text1"/>
+                          <w:sz w:val="16"/>
+                          <w:szCs w:val="16"/>
+                        </w:rPr>
+                      </w:pPr>
+                      <w:r>
+                        <w:rPr>
+                          <w:rFonts w:ascii="Times New Roman" w:hAnsi="Times New Roman" w:cs="Times New Roman"/>
+                          <w:color w:val="000000" w:themeColor="text1"/>
+                          <w:sz w:val="16"/>
+                          <w:szCs w:val="16"/>
+                        </w:rPr>
+                        <w:t>Figure 7: Perlin</w:t>
+                      </w:r>
+                      <w:r>
+                        <w:rPr>
+                          <w:rFonts w:ascii="Times New Roman" w:hAnsi="Times New Roman" w:cs="Times New Roman"/>
+                          <w:color w:val="000000" w:themeColor="text1"/>
+                          <w:sz w:val="16"/>
+                          <w:szCs w:val="16"/>
+                        </w:rPr>
+                        <w:tab/>
+                        <w:t xml:space="preserve">Figure 8: Image Texture       Figure 9: Checkered </w:t>
+                      </w:r>
+                    </w:p>
+                  </w:txbxContent>
+                </v:textbox>
+              </v:rect>
+            </w:pict>
+          </mc:Fallback>
+        </mc:AlternateContent>
+      </w:r>
       <w:r>
         <w:rPr>
           <w:b/>
@@ -903,7 +1766,7 @@
                     </pic:cNvPicPr>
                   </pic:nvPicPr>
                   <pic:blipFill rotWithShape="1">
-                    <a:blip r:embed="rId12">
+                    <a:blip r:embed="rId13">
                       <a:extLst>
                         <a:ext uri="{28A0092B-C50C-407E-A947-70E740481C1C}">
                           <a14:useLocalDpi xmlns:a14="http://schemas.microsoft.com/office/drawing/2010/main" val="0"/>
@@ -965,7 +1828,7 @@
                     </pic:cNvPicPr>
                   </pic:nvPicPr>
                   <pic:blipFill>
-                    <a:blip r:embed="rId13" cstate="print">
+                    <a:blip r:embed="rId14" cstate="print">
                       <a:extLst>
                         <a:ext uri="{28A0092B-C50C-407E-A947-70E740481C1C}">
                           <a14:useLocalDpi xmlns:a14="http://schemas.microsoft.com/office/drawing/2010/main" val="0"/>
@@ -1022,7 +1885,7 @@
                     </pic:cNvPicPr>
                   </pic:nvPicPr>
                   <pic:blipFill rotWithShape="1">
-                    <a:blip r:embed="rId14">
+                    <a:blip r:embed="rId15">
                       <a:extLst>
                         <a:ext uri="{28A0092B-C50C-407E-A947-70E740481C1C}">
                           <a14:useLocalDpi xmlns:a14="http://schemas.microsoft.com/office/drawing/2010/main" val="0"/>
@@ -1061,6 +1924,7 @@
     </w:p>
     <w:p>
       <w:pPr>
+        <w:spacing w:before="360"/>
         <w:rPr>
           <w:rFonts w:ascii="Times New Roman" w:hAnsi="Times New Roman" w:cs="Times New Roman"/>
           <w:b/>
@@ -1098,6 +1962,138 @@
           <w:bCs/>
         </w:rPr>
       </w:pPr>
+      <w:r>
+        <w:rPr>
+          <w:rFonts w:ascii="Times New Roman" w:hAnsi="Times New Roman" w:cs="Times New Roman"/>
+          <w:b/>
+          <w:bCs/>
+          <w:noProof/>
+          <w:sz w:val="28"/>
+          <w:szCs w:val="28"/>
+        </w:rPr>
+        <mc:AlternateContent>
+          <mc:Choice Requires="wps">
+            <w:drawing>
+              <wp:anchor distT="0" distB="0" distL="114300" distR="114300" simplePos="0" relativeHeight="251669504" behindDoc="0" locked="0" layoutInCell="1" allowOverlap="1" wp14:anchorId="7E086BB7" wp14:editId="0D463FA1">
+                <wp:simplePos x="0" y="0"/>
+                <wp:positionH relativeFrom="column">
+                  <wp:align>right</wp:align>
+                </wp:positionH>
+                <wp:positionV relativeFrom="paragraph">
+                  <wp:posOffset>1227455</wp:posOffset>
+                </wp:positionV>
+                <wp:extent cx="3185160" cy="266700"/>
+                <wp:effectExtent l="0" t="0" r="15240" b="19050"/>
+                <wp:wrapNone/>
+                <wp:docPr id="295653606" name="Rectangle 1"/>
+                <wp:cNvGraphicFramePr/>
+                <a:graphic xmlns:a="http://schemas.openxmlformats.org/drawingml/2006/main">
+                  <a:graphicData uri="http://schemas.microsoft.com/office/word/2010/wordprocessingShape">
+                    <wps:wsp>
+                      <wps:cNvSpPr/>
+                      <wps:spPr>
+                        <a:xfrm>
+                          <a:off x="0" y="0"/>
+                          <a:ext cx="3185160" cy="266700"/>
+                        </a:xfrm>
+                        <a:prstGeom prst="rect">
+                          <a:avLst/>
+                        </a:prstGeom>
+                        <a:noFill/>
+                        <a:ln>
+                          <a:solidFill>
+                            <a:schemeClr val="bg1"/>
+                          </a:solidFill>
+                        </a:ln>
+                      </wps:spPr>
+                      <wps:style>
+                        <a:lnRef idx="2">
+                          <a:schemeClr val="accent6"/>
+                        </a:lnRef>
+                        <a:fillRef idx="1">
+                          <a:schemeClr val="lt1"/>
+                        </a:fillRef>
+                        <a:effectRef idx="0">
+                          <a:schemeClr val="accent6"/>
+                        </a:effectRef>
+                        <a:fontRef idx="minor">
+                          <a:schemeClr val="dk1"/>
+                        </a:fontRef>
+                      </wps:style>
+                      <wps:txbx>
+                        <w:txbxContent>
+                          <w:p>
+                            <w:pPr>
+                              <w:jc w:val="center"/>
+                              <w:rPr>
+                                <w:rFonts w:ascii="Times New Roman" w:hAnsi="Times New Roman" w:cs="Times New Roman"/>
+                                <w:color w:val="000000" w:themeColor="text1"/>
+                                <w:sz w:val="16"/>
+                                <w:szCs w:val="16"/>
+                              </w:rPr>
+                            </w:pPr>
+                            <w:r>
+                              <w:rPr>
+                                <w:rFonts w:ascii="Times New Roman" w:hAnsi="Times New Roman" w:cs="Times New Roman"/>
+                                <w:color w:val="000000" w:themeColor="text1"/>
+                                <w:sz w:val="16"/>
+                                <w:szCs w:val="16"/>
+                              </w:rPr>
+                              <w:t>Figure 10: Motion Blur on Spheres</w:t>
+                            </w:r>
+                          </w:p>
+                        </w:txbxContent>
+                      </wps:txbx>
+                      <wps:bodyPr rot="0" spcFirstLastPara="0" vertOverflow="overflow" horzOverflow="overflow" vert="horz" wrap="square" lIns="91440" tIns="45720" rIns="91440" bIns="45720" numCol="1" spcCol="0" rtlCol="0" fromWordArt="0" anchor="ctr" anchorCtr="0" forceAA="0" compatLnSpc="1">
+                        <a:prstTxWarp prst="textNoShape">
+                          <a:avLst/>
+                        </a:prstTxWarp>
+                        <a:noAutofit/>
+                      </wps:bodyPr>
+                    </wps:wsp>
+                  </a:graphicData>
+                </a:graphic>
+                <wp14:sizeRelH relativeFrom="margin">
+                  <wp14:pctWidth>0</wp14:pctWidth>
+                </wp14:sizeRelH>
+                <wp14:sizeRelV relativeFrom="margin">
+                  <wp14:pctHeight>0</wp14:pctHeight>
+                </wp14:sizeRelV>
+              </wp:anchor>
+            </w:drawing>
+          </mc:Choice>
+          <mc:Fallback>
+            <w:pict>
+              <v:rect w14:anchorId="7E086BB7" id="_x0000_s1031" style="position:absolute;left:0;text-align:left;margin-left:199.6pt;margin-top:96.65pt;width:250.8pt;height:21pt;z-index:251669504;visibility:visible;mso-wrap-style:square;mso-width-percent:0;mso-height-percent:0;mso-wrap-distance-left:9pt;mso-wrap-distance-top:0;mso-wrap-distance-right:9pt;mso-wrap-distance-bottom:0;mso-position-horizontal:right;mso-position-horizontal-relative:text;mso-position-vertical:absolute;mso-position-vertical-relative:text;mso-width-percent:0;mso-height-percent:0;mso-width-relative:margin;mso-height-relative:margin;v-text-anchor:middle" o:gfxdata="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" filled="f" strokecolor="white [3212]" strokeweight="1pt">
+                <v:textbox>
+                  <w:txbxContent>
+                    <w:p>
+                      <w:pPr>
+                        <w:jc w:val="center"/>
+                        <w:rPr>
+                          <w:rFonts w:ascii="Times New Roman" w:hAnsi="Times New Roman" w:cs="Times New Roman"/>
+                          <w:color w:val="000000" w:themeColor="text1"/>
+                          <w:sz w:val="16"/>
+                          <w:szCs w:val="16"/>
+                        </w:rPr>
+                      </w:pPr>
+                      <w:r>
+                        <w:rPr>
+                          <w:rFonts w:ascii="Times New Roman" w:hAnsi="Times New Roman" w:cs="Times New Roman"/>
+                          <w:color w:val="000000" w:themeColor="text1"/>
+                          <w:sz w:val="16"/>
+                          <w:szCs w:val="16"/>
+                        </w:rPr>
+                        <w:t>Figure 10: Motion Blur on Spheres</w:t>
+                      </w:r>
+                    </w:p>
+                  </w:txbxContent>
+                </v:textbox>
+              </v:rect>
+            </w:pict>
+          </mc:Fallback>
+        </mc:AlternateContent>
+      </w:r>
       <w:r>
         <w:rPr>
           <w:b/>
@@ -1107,9 +2103,9 @@
           <w:bdr w:val="none" w:sz="0" w:space="0" w:color="auto" w:frame="1"/>
         </w:rPr>
         <w:drawing>
-          <wp:inline distT="0" distB="0" distL="0" distR="0" wp14:anchorId="288D8B6B" wp14:editId="0BD09645">
-            <wp:extent cx="2440806" cy="1363980"/>
-            <wp:effectExtent l="0" t="0" r="0" b="7620"/>
+          <wp:inline distT="0" distB="0" distL="0" distR="0" wp14:anchorId="288D8B6B" wp14:editId="047A7A53">
+            <wp:extent cx="2211918" cy="1219200"/>
+            <wp:effectExtent l="0" t="0" r="0" b="0"/>
             <wp:docPr id="922910051" name="Picture 58" descr="A group of colorful balls&#10;&#10;AI-generated content may be incorrect."/>
             <wp:cNvGraphicFramePr>
               <a:graphicFrameLocks xmlns:a="http://schemas.openxmlformats.org/drawingml/2006/main" noChangeAspect="1"/>
@@ -1123,15 +2119,15 @@
                       <a:picLocks noChangeAspect="1" noChangeArrowheads="1"/>
                     </pic:cNvPicPr>
                   </pic:nvPicPr>
-                  <pic:blipFill>
-                    <a:blip r:embed="rId15">
+                  <pic:blipFill rotWithShape="1">
+                    <a:blip r:embed="rId16">
                       <a:extLst>
                         <a:ext uri="{28A0092B-C50C-407E-A947-70E740481C1C}">
                           <a14:useLocalDpi xmlns:a14="http://schemas.microsoft.com/office/drawing/2010/main" val="0"/>
                         </a:ext>
                       </a:extLst>
                     </a:blip>
-                    <a:srcRect/>
+                    <a:srcRect l="11276" r="7573" b="19956"/>
                     <a:stretch>
                       <a:fillRect/>
                     </a:stretch>
@@ -1139,7 +2135,7 @@
                   <pic:spPr bwMode="auto">
                     <a:xfrm>
                       <a:off x="0" y="0"/>
-                      <a:ext cx="2443233" cy="1365337"/>
+                      <a:ext cx="2241465" cy="1235486"/>
                     </a:xfrm>
                     <a:prstGeom prst="rect">
                       <a:avLst/>
@@ -1148,6 +2144,11 @@
                     <a:ln>
                       <a:noFill/>
                     </a:ln>
+                    <a:extLst>
+                      <a:ext uri="{53640926-AAD7-44D8-BBD7-CCE9431645EC}">
+                        <a14:shadowObscured xmlns:a14="http://schemas.microsoft.com/office/drawing/2010/main"/>
+                      </a:ext>
+                    </a:extLst>
                   </pic:spPr>
                 </pic:pic>
               </a:graphicData>
@@ -1170,7 +2171,6 @@
           <w:b/>
           <w:bCs/>
         </w:rPr>
-        <w:lastRenderedPageBreak/>
         <w:t>Volume Rendering:</w:t>
       </w:r>
     </w:p>
@@ -1196,6 +2196,139 @@
           <w:bCs/>
         </w:rPr>
       </w:pPr>
+      <w:r>
+        <w:rPr>
+          <w:rFonts w:ascii="Times New Roman" w:hAnsi="Times New Roman" w:cs="Times New Roman"/>
+          <w:b/>
+          <w:bCs/>
+          <w:noProof/>
+          <w:sz w:val="28"/>
+          <w:szCs w:val="28"/>
+        </w:rPr>
+        <mc:AlternateContent>
+          <mc:Choice Requires="wps">
+            <w:drawing>
+              <wp:anchor distT="0" distB="0" distL="114300" distR="114300" simplePos="0" relativeHeight="251671552" behindDoc="0" locked="0" layoutInCell="1" allowOverlap="1" wp14:anchorId="02751A03" wp14:editId="78AF4998">
+                <wp:simplePos x="0" y="0"/>
+                <wp:positionH relativeFrom="margin">
+                  <wp:align>right</wp:align>
+                </wp:positionH>
+                <wp:positionV relativeFrom="paragraph">
+                  <wp:posOffset>2405380</wp:posOffset>
+                </wp:positionV>
+                <wp:extent cx="3185160" cy="228600"/>
+                <wp:effectExtent l="0" t="0" r="15240" b="19050"/>
+                <wp:wrapNone/>
+                <wp:docPr id="807173242" name="Rectangle 1"/>
+                <wp:cNvGraphicFramePr/>
+                <a:graphic xmlns:a="http://schemas.openxmlformats.org/drawingml/2006/main">
+                  <a:graphicData uri="http://schemas.microsoft.com/office/word/2010/wordprocessingShape">
+                    <wps:wsp>
+                      <wps:cNvSpPr/>
+                      <wps:spPr>
+                        <a:xfrm>
+                          <a:off x="0" y="0"/>
+                          <a:ext cx="3185160" cy="228600"/>
+                        </a:xfrm>
+                        <a:prstGeom prst="rect">
+                          <a:avLst/>
+                        </a:prstGeom>
+                        <a:noFill/>
+                        <a:ln>
+                          <a:solidFill>
+                            <a:schemeClr val="bg1"/>
+                          </a:solidFill>
+                        </a:ln>
+                      </wps:spPr>
+                      <wps:style>
+                        <a:lnRef idx="2">
+                          <a:schemeClr val="accent6"/>
+                        </a:lnRef>
+                        <a:fillRef idx="1">
+                          <a:schemeClr val="lt1"/>
+                        </a:fillRef>
+                        <a:effectRef idx="0">
+                          <a:schemeClr val="accent6"/>
+                        </a:effectRef>
+                        <a:fontRef idx="minor">
+                          <a:schemeClr val="dk1"/>
+                        </a:fontRef>
+                      </wps:style>
+                      <wps:txbx>
+                        <w:txbxContent>
+                          <w:p>
+                            <w:pPr>
+                              <w:jc w:val="center"/>
+                              <w:rPr>
+                                <w:rFonts w:ascii="Times New Roman" w:hAnsi="Times New Roman" w:cs="Times New Roman"/>
+                                <w:color w:val="000000" w:themeColor="text1"/>
+                                <w:sz w:val="16"/>
+                                <w:szCs w:val="16"/>
+                              </w:rPr>
+                            </w:pPr>
+                            <w:r>
+                              <w:rPr>
+                                <w:rFonts w:ascii="Times New Roman" w:hAnsi="Times New Roman" w:cs="Times New Roman"/>
+                                <w:color w:val="000000" w:themeColor="text1"/>
+                                <w:sz w:val="16"/>
+                                <w:szCs w:val="16"/>
+                              </w:rPr>
+                              <w:t>Figure 11: Volumes, Texture, Spheres and Quads</w:t>
+                            </w:r>
+                          </w:p>
+                        </w:txbxContent>
+                      </wps:txbx>
+                      <wps:bodyPr rot="0" spcFirstLastPara="0" vertOverflow="overflow" horzOverflow="overflow" vert="horz" wrap="square" lIns="91440" tIns="45720" rIns="91440" bIns="45720" numCol="1" spcCol="0" rtlCol="0" fromWordArt="0" anchor="ctr" anchorCtr="0" forceAA="0" compatLnSpc="1">
+                        <a:prstTxWarp prst="textNoShape">
+                          <a:avLst/>
+                        </a:prstTxWarp>
+                        <a:noAutofit/>
+                      </wps:bodyPr>
+                    </wps:wsp>
+                  </a:graphicData>
+                </a:graphic>
+                <wp14:sizeRelH relativeFrom="margin">
+                  <wp14:pctWidth>0</wp14:pctWidth>
+                </wp14:sizeRelH>
+                <wp14:sizeRelV relativeFrom="margin">
+                  <wp14:pctHeight>0</wp14:pctHeight>
+                </wp14:sizeRelV>
+              </wp:anchor>
+            </w:drawing>
+          </mc:Choice>
+          <mc:Fallback>
+            <w:pict>
+              <v:rect w14:anchorId="02751A03" id="_x0000_s1032" style="position:absolute;left:0;text-align:left;margin-left:199.6pt;margin-top:189.4pt;width:250.8pt;height:18pt;z-index:251671552;visibility:visible;mso-wrap-style:square;mso-width-percent:0;mso-height-percent:0;mso-wrap-distance-left:9pt;mso-wrap-distance-top:0;mso-wrap-distance-right:9pt;mso-wrap-distance-bottom:0;mso-position-horizontal:right;mso-position-horizontal-relative:margin;mso-position-vertical:absolute;mso-position-vertical-relative:text;mso-width-percent:0;mso-height-percent:0;mso-width-relative:margin;mso-height-relative:margin;v-text-anchor:middle" o:gfxdata="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" filled="f" strokecolor="white [3212]" strokeweight="1pt">
+                <v:textbox>
+                  <w:txbxContent>
+                    <w:p>
+                      <w:pPr>
+                        <w:jc w:val="center"/>
+                        <w:rPr>
+                          <w:rFonts w:ascii="Times New Roman" w:hAnsi="Times New Roman" w:cs="Times New Roman"/>
+                          <w:color w:val="000000" w:themeColor="text1"/>
+                          <w:sz w:val="16"/>
+                          <w:szCs w:val="16"/>
+                        </w:rPr>
+                      </w:pPr>
+                      <w:r>
+                        <w:rPr>
+                          <w:rFonts w:ascii="Times New Roman" w:hAnsi="Times New Roman" w:cs="Times New Roman"/>
+                          <w:color w:val="000000" w:themeColor="text1"/>
+                          <w:sz w:val="16"/>
+                          <w:szCs w:val="16"/>
+                        </w:rPr>
+                        <w:t>Figure 11: Volumes, Texture, Spheres and Quads</w:t>
+                      </w:r>
+                    </w:p>
+                  </w:txbxContent>
+                </v:textbox>
+                <w10:wrap anchorx="margin"/>
+              </v:rect>
+            </w:pict>
+          </mc:Fallback>
+        </mc:AlternateContent>
+      </w:r>
       <w:r>
         <w:rPr>
           <w:b/>
@@ -1222,7 +2355,7 @@
                     </pic:cNvPicPr>
                   </pic:nvPicPr>
                   <pic:blipFill>
-                    <a:blip r:embed="rId16">
+                    <a:blip r:embed="rId17">
                       <a:extLst>
                         <a:ext uri="{28A0092B-C50C-407E-A947-70E740481C1C}">
                           <a14:useLocalDpi xmlns:a14="http://schemas.microsoft.com/office/drawing/2010/main" val="0"/>
@@ -1256,6 +2389,7 @@
     </w:p>
     <w:p>
       <w:pPr>
+        <w:spacing w:before="300"/>
         <w:rPr>
           <w:rFonts w:ascii="Times New Roman" w:hAnsi="Times New Roman" w:cs="Times New Roman"/>
           <w:b/>
@@ -1321,6 +2455,211 @@
           <w:bCs/>
         </w:rPr>
       </w:pPr>
+      <w:r>
+        <w:rPr>
+          <w:rFonts w:ascii="Times New Roman" w:hAnsi="Times New Roman" w:cs="Times New Roman"/>
+          <w:b/>
+          <w:bCs/>
+          <w:noProof/>
+          <w:sz w:val="28"/>
+          <w:szCs w:val="28"/>
+        </w:rPr>
+        <mc:AlternateContent>
+          <mc:Choice Requires="wps">
+            <w:drawing>
+              <wp:anchor distT="0" distB="0" distL="114300" distR="114300" simplePos="0" relativeHeight="251673600" behindDoc="0" locked="0" layoutInCell="1" allowOverlap="1" wp14:anchorId="27795F08" wp14:editId="502F6A69">
+                <wp:simplePos x="0" y="0"/>
+                <wp:positionH relativeFrom="margin">
+                  <wp:posOffset>3710940</wp:posOffset>
+                </wp:positionH>
+                <wp:positionV relativeFrom="paragraph">
+                  <wp:posOffset>1480185</wp:posOffset>
+                </wp:positionV>
+                <wp:extent cx="3185160" cy="228600"/>
+                <wp:effectExtent l="0" t="0" r="15240" b="19050"/>
+                <wp:wrapNone/>
+                <wp:docPr id="406345593" name="Rectangle 1"/>
+                <wp:cNvGraphicFramePr/>
+                <a:graphic xmlns:a="http://schemas.openxmlformats.org/drawingml/2006/main">
+                  <a:graphicData uri="http://schemas.microsoft.com/office/word/2010/wordprocessingShape">
+                    <wps:wsp>
+                      <wps:cNvSpPr/>
+                      <wps:spPr>
+                        <a:xfrm>
+                          <a:off x="0" y="0"/>
+                          <a:ext cx="3185160" cy="228600"/>
+                        </a:xfrm>
+                        <a:prstGeom prst="rect">
+                          <a:avLst/>
+                        </a:prstGeom>
+                        <a:noFill/>
+                        <a:ln>
+                          <a:solidFill>
+                            <a:schemeClr val="bg1"/>
+                          </a:solidFill>
+                        </a:ln>
+                      </wps:spPr>
+                      <wps:style>
+                        <a:lnRef idx="2">
+                          <a:schemeClr val="accent6"/>
+                        </a:lnRef>
+                        <a:fillRef idx="1">
+                          <a:schemeClr val="lt1"/>
+                        </a:fillRef>
+                        <a:effectRef idx="0">
+                          <a:schemeClr val="accent6"/>
+                        </a:effectRef>
+                        <a:fontRef idx="minor">
+                          <a:schemeClr val="dk1"/>
+                        </a:fontRef>
+                      </wps:style>
+                      <wps:txbx>
+                        <w:txbxContent>
+                          <w:p>
+                            <w:pPr>
+                              <w:rPr>
+                                <w:rFonts w:ascii="Times New Roman" w:hAnsi="Times New Roman" w:cs="Times New Roman"/>
+                                <w:color w:val="000000" w:themeColor="text1"/>
+                                <w:sz w:val="16"/>
+                                <w:szCs w:val="16"/>
+                              </w:rPr>
+                            </w:pPr>
+                            <w:r>
+                              <w:rPr>
+                                <w:rFonts w:ascii="Times New Roman" w:hAnsi="Times New Roman" w:cs="Times New Roman"/>
+                                <w:color w:val="000000" w:themeColor="text1"/>
+                                <w:sz w:val="16"/>
+                                <w:szCs w:val="16"/>
+                              </w:rPr>
+                              <w:t xml:space="preserve">       </w:t>
+                            </w:r>
+                            <w:r>
+                              <w:rPr>
+                                <w:rFonts w:ascii="Times New Roman" w:hAnsi="Times New Roman" w:cs="Times New Roman"/>
+                                <w:color w:val="000000" w:themeColor="text1"/>
+                                <w:sz w:val="16"/>
+                                <w:szCs w:val="16"/>
+                              </w:rPr>
+                              <w:t>Figure 1</w:t>
+                            </w:r>
+                            <w:r>
+                              <w:rPr>
+                                <w:rFonts w:ascii="Times New Roman" w:hAnsi="Times New Roman" w:cs="Times New Roman"/>
+                                <w:color w:val="000000" w:themeColor="text1"/>
+                                <w:sz w:val="16"/>
+                                <w:szCs w:val="16"/>
+                              </w:rPr>
+                              <w:t>2: Pre-NI</w:t>
+                            </w:r>
+                            <w:r>
+                              <w:rPr>
+                                <w:rFonts w:ascii="Times New Roman" w:hAnsi="Times New Roman" w:cs="Times New Roman"/>
+                                <w:color w:val="000000" w:themeColor="text1"/>
+                                <w:sz w:val="16"/>
+                                <w:szCs w:val="16"/>
+                              </w:rPr>
+                              <w:tab/>
+                            </w:r>
+                            <w:r>
+                              <w:rPr>
+                                <w:rFonts w:ascii="Times New Roman" w:hAnsi="Times New Roman" w:cs="Times New Roman"/>
+                                <w:color w:val="000000" w:themeColor="text1"/>
+                                <w:sz w:val="16"/>
+                                <w:szCs w:val="16"/>
+                              </w:rPr>
+                              <w:tab/>
+                              <w:t>Figure 13: Post-NI</w:t>
+                            </w:r>
+                          </w:p>
+                        </w:txbxContent>
+                      </wps:txbx>
+                      <wps:bodyPr rot="0" spcFirstLastPara="0" vertOverflow="overflow" horzOverflow="overflow" vert="horz" wrap="square" lIns="91440" tIns="45720" rIns="91440" bIns="45720" numCol="1" spcCol="0" rtlCol="0" fromWordArt="0" anchor="ctr" anchorCtr="0" forceAA="0" compatLnSpc="1">
+                        <a:prstTxWarp prst="textNoShape">
+                          <a:avLst/>
+                        </a:prstTxWarp>
+                        <a:noAutofit/>
+                      </wps:bodyPr>
+                    </wps:wsp>
+                  </a:graphicData>
+                </a:graphic>
+                <wp14:sizeRelH relativeFrom="margin">
+                  <wp14:pctWidth>0</wp14:pctWidth>
+                </wp14:sizeRelH>
+                <wp14:sizeRelV relativeFrom="margin">
+                  <wp14:pctHeight>0</wp14:pctHeight>
+                </wp14:sizeRelV>
+              </wp:anchor>
+            </w:drawing>
+          </mc:Choice>
+          <mc:Fallback>
+            <w:pict>
+              <v:rect w14:anchorId="27795F08" id="_x0000_s1033" style="position:absolute;left:0;text-align:left;margin-left:292.2pt;margin-top:116.55pt;width:250.8pt;height:18pt;z-index:251673600;visibility:visible;mso-wrap-style:square;mso-width-percent:0;mso-height-percent:0;mso-wrap-distance-left:9pt;mso-wrap-distance-top:0;mso-wrap-distance-right:9pt;mso-wrap-distance-bottom:0;mso-position-horizontal:absolute;mso-position-horizontal-relative:margin;mso-position-vertical:absolute;mso-position-vertical-relative:text;mso-width-percent:0;mso-height-percent:0;mso-width-relative:margin;mso-height-relative:margin;v-text-anchor:middle" o:gfxdata="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" filled="f" strokecolor="white [3212]" strokeweight="1pt">
+                <v:textbox>
+                  <w:txbxContent>
+                    <w:p>
+                      <w:pPr>
+                        <w:rPr>
+                          <w:rFonts w:ascii="Times New Roman" w:hAnsi="Times New Roman" w:cs="Times New Roman"/>
+                          <w:color w:val="000000" w:themeColor="text1"/>
+                          <w:sz w:val="16"/>
+                          <w:szCs w:val="16"/>
+                        </w:rPr>
+                      </w:pPr>
+                      <w:r>
+                        <w:rPr>
+                          <w:rFonts w:ascii="Times New Roman" w:hAnsi="Times New Roman" w:cs="Times New Roman"/>
+                          <w:color w:val="000000" w:themeColor="text1"/>
+                          <w:sz w:val="16"/>
+                          <w:szCs w:val="16"/>
+                        </w:rPr>
+                        <w:t xml:space="preserve">       </w:t>
+                      </w:r>
+                      <w:r>
+                        <w:rPr>
+                          <w:rFonts w:ascii="Times New Roman" w:hAnsi="Times New Roman" w:cs="Times New Roman"/>
+                          <w:color w:val="000000" w:themeColor="text1"/>
+                          <w:sz w:val="16"/>
+                          <w:szCs w:val="16"/>
+                        </w:rPr>
+                        <w:t>Figure 1</w:t>
+                      </w:r>
+                      <w:r>
+                        <w:rPr>
+                          <w:rFonts w:ascii="Times New Roman" w:hAnsi="Times New Roman" w:cs="Times New Roman"/>
+                          <w:color w:val="000000" w:themeColor="text1"/>
+                          <w:sz w:val="16"/>
+                          <w:szCs w:val="16"/>
+                        </w:rPr>
+                        <w:t>2: Pre-NI</w:t>
+                      </w:r>
+                      <w:r>
+                        <w:rPr>
+                          <w:rFonts w:ascii="Times New Roman" w:hAnsi="Times New Roman" w:cs="Times New Roman"/>
+                          <w:color w:val="000000" w:themeColor="text1"/>
+                          <w:sz w:val="16"/>
+                          <w:szCs w:val="16"/>
+                        </w:rPr>
+                        <w:tab/>
+                      </w:r>
+                      <w:r>
+                        <w:rPr>
+                          <w:rFonts w:ascii="Times New Roman" w:hAnsi="Times New Roman" w:cs="Times New Roman"/>
+                          <w:color w:val="000000" w:themeColor="text1"/>
+                          <w:sz w:val="16"/>
+                          <w:szCs w:val="16"/>
+                        </w:rPr>
+                        <w:tab/>
+                        <w:t>Figure 13: Post-NI</w:t>
+                      </w:r>
+                    </w:p>
+                  </w:txbxContent>
+                </v:textbox>
+                <w10:wrap anchorx="margin"/>
+              </v:rect>
+            </w:pict>
+          </mc:Fallback>
+        </mc:AlternateContent>
+      </w:r>
       <w:r>
         <w:rPr>
           <w:b/>
@@ -1347,7 +2686,7 @@
                     </pic:cNvPicPr>
                   </pic:nvPicPr>
                   <pic:blipFill rotWithShape="1">
-                    <a:blip r:embed="rId17">
+                    <a:blip r:embed="rId18">
                       <a:extLst>
                         <a:ext uri="{28A0092B-C50C-407E-A947-70E740481C1C}">
                           <a14:useLocalDpi xmlns:a14="http://schemas.microsoft.com/office/drawing/2010/main" val="0"/>
@@ -1417,7 +2756,7 @@
                     </pic:cNvPicPr>
                   </pic:nvPicPr>
                   <pic:blipFill rotWithShape="1">
-                    <a:blip r:embed="rId18">
+                    <a:blip r:embed="rId19">
                       <a:extLst>
                         <a:ext uri="{28A0092B-C50C-407E-A947-70E740481C1C}">
                           <a14:useLocalDpi xmlns:a14="http://schemas.microsoft.com/office/drawing/2010/main" val="0"/>
@@ -1468,6 +2807,7 @@
           <w:b/>
           <w:bCs/>
         </w:rPr>
+        <w:lastRenderedPageBreak/>
         <w:t>Environment/Cube Mapping:</w:t>
       </w:r>
     </w:p>
@@ -1501,6 +2841,196 @@
           <w:bCs/>
         </w:rPr>
       </w:pPr>
+      <w:r>
+        <w:rPr>
+          <w:rFonts w:ascii="Times New Roman" w:hAnsi="Times New Roman" w:cs="Times New Roman"/>
+          <w:b/>
+          <w:bCs/>
+          <w:noProof/>
+          <w:sz w:val="28"/>
+          <w:szCs w:val="28"/>
+        </w:rPr>
+        <mc:AlternateContent>
+          <mc:Choice Requires="wps">
+            <w:drawing>
+              <wp:anchor distT="0" distB="0" distL="114300" distR="114300" simplePos="0" relativeHeight="251675648" behindDoc="0" locked="0" layoutInCell="1" allowOverlap="1" wp14:anchorId="3848C76E" wp14:editId="4FEDFF42">
+                <wp:simplePos x="0" y="0"/>
+                <wp:positionH relativeFrom="column">
+                  <wp:align>right</wp:align>
+                </wp:positionH>
+                <wp:positionV relativeFrom="paragraph">
+                  <wp:posOffset>1532890</wp:posOffset>
+                </wp:positionV>
+                <wp:extent cx="3185160" cy="228600"/>
+                <wp:effectExtent l="0" t="0" r="15240" b="19050"/>
+                <wp:wrapNone/>
+                <wp:docPr id="1737837555" name="Rectangle 1"/>
+                <wp:cNvGraphicFramePr/>
+                <a:graphic xmlns:a="http://schemas.openxmlformats.org/drawingml/2006/main">
+                  <a:graphicData uri="http://schemas.microsoft.com/office/word/2010/wordprocessingShape">
+                    <wps:wsp>
+                      <wps:cNvSpPr/>
+                      <wps:spPr>
+                        <a:xfrm>
+                          <a:off x="0" y="0"/>
+                          <a:ext cx="3185160" cy="228600"/>
+                        </a:xfrm>
+                        <a:prstGeom prst="rect">
+                          <a:avLst/>
+                        </a:prstGeom>
+                        <a:noFill/>
+                        <a:ln>
+                          <a:solidFill>
+                            <a:schemeClr val="bg1"/>
+                          </a:solidFill>
+                        </a:ln>
+                      </wps:spPr>
+                      <wps:style>
+                        <a:lnRef idx="2">
+                          <a:schemeClr val="accent6"/>
+                        </a:lnRef>
+                        <a:fillRef idx="1">
+                          <a:schemeClr val="lt1"/>
+                        </a:fillRef>
+                        <a:effectRef idx="0">
+                          <a:schemeClr val="accent6"/>
+                        </a:effectRef>
+                        <a:fontRef idx="minor">
+                          <a:schemeClr val="dk1"/>
+                        </a:fontRef>
+                      </wps:style>
+                      <wps:txbx>
+                        <w:txbxContent>
+                          <w:p>
+                            <w:pPr>
+                              <w:jc w:val="center"/>
+                              <w:rPr>
+                                <w:rFonts w:ascii="Times New Roman" w:hAnsi="Times New Roman" w:cs="Times New Roman"/>
+                                <w:color w:val="000000" w:themeColor="text1"/>
+                                <w:sz w:val="16"/>
+                                <w:szCs w:val="16"/>
+                              </w:rPr>
+                            </w:pPr>
+                            <w:r>
+                              <w:rPr>
+                                <w:rFonts w:ascii="Times New Roman" w:hAnsi="Times New Roman" w:cs="Times New Roman"/>
+                                <w:color w:val="000000" w:themeColor="text1"/>
+                                <w:sz w:val="16"/>
+                                <w:szCs w:val="16"/>
+                              </w:rPr>
+                              <w:t>Figure</w:t>
+                            </w:r>
+                            <w:r>
+                              <w:rPr>
+                                <w:rFonts w:ascii="Times New Roman" w:hAnsi="Times New Roman" w:cs="Times New Roman"/>
+                                <w:color w:val="000000" w:themeColor="text1"/>
+                                <w:sz w:val="16"/>
+                                <w:szCs w:val="16"/>
+                              </w:rPr>
+                              <w:t xml:space="preserve"> </w:t>
+                            </w:r>
+                            <w:proofErr w:type="gramStart"/>
+                            <w:r>
+                              <w:rPr>
+                                <w:rFonts w:ascii="Times New Roman" w:hAnsi="Times New Roman" w:cs="Times New Roman"/>
+                                <w:color w:val="000000" w:themeColor="text1"/>
+                                <w:sz w:val="16"/>
+                                <w:szCs w:val="16"/>
+                              </w:rPr>
+                              <w:t>14:Spheres</w:t>
+                            </w:r>
+                            <w:proofErr w:type="gramEnd"/>
+                            <w:r>
+                              <w:rPr>
+                                <w:rFonts w:ascii="Times New Roman" w:hAnsi="Times New Roman" w:cs="Times New Roman"/>
+                                <w:color w:val="000000" w:themeColor="text1"/>
+                                <w:sz w:val="16"/>
+                                <w:szCs w:val="16"/>
+                              </w:rPr>
+                              <w:t xml:space="preserve"> by the Lake</w:t>
+                            </w:r>
+                          </w:p>
+                        </w:txbxContent>
+                      </wps:txbx>
+                      <wps:bodyPr rot="0" spcFirstLastPara="0" vertOverflow="overflow" horzOverflow="overflow" vert="horz" wrap="square" lIns="91440" tIns="45720" rIns="91440" bIns="45720" numCol="1" spcCol="0" rtlCol="0" fromWordArt="0" anchor="ctr" anchorCtr="0" forceAA="0" compatLnSpc="1">
+                        <a:prstTxWarp prst="textNoShape">
+                          <a:avLst/>
+                        </a:prstTxWarp>
+                        <a:noAutofit/>
+                      </wps:bodyPr>
+                    </wps:wsp>
+                  </a:graphicData>
+                </a:graphic>
+                <wp14:sizeRelH relativeFrom="margin">
+                  <wp14:pctWidth>0</wp14:pctWidth>
+                </wp14:sizeRelH>
+                <wp14:sizeRelV relativeFrom="margin">
+                  <wp14:pctHeight>0</wp14:pctHeight>
+                </wp14:sizeRelV>
+              </wp:anchor>
+            </w:drawing>
+          </mc:Choice>
+          <mc:Fallback>
+            <w:pict>
+              <v:rect w14:anchorId="3848C76E" id="_x0000_s1034" style="position:absolute;left:0;text-align:left;margin-left:199.6pt;margin-top:120.7pt;width:250.8pt;height:18pt;z-index:251675648;visibility:visible;mso-wrap-style:square;mso-width-percent:0;mso-height-percent:0;mso-wrap-distance-left:9pt;mso-wrap-distance-top:0;mso-wrap-distance-right:9pt;mso-wrap-distance-bottom:0;mso-position-horizontal:right;mso-position-horizontal-relative:text;mso-position-vertical:absolute;mso-position-vertical-relative:text;mso-width-percent:0;mso-height-percent:0;mso-width-relative:margin;mso-height-relative:margin;v-text-anchor:middle" o:gfxdata="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" filled="f" strokecolor="white [3212]" strokeweight="1pt">
+                <v:textbox>
+                  <w:txbxContent>
+                    <w:p>
+                      <w:pPr>
+                        <w:jc w:val="center"/>
+                        <w:rPr>
+                          <w:rFonts w:ascii="Times New Roman" w:hAnsi="Times New Roman" w:cs="Times New Roman"/>
+                          <w:color w:val="000000" w:themeColor="text1"/>
+                          <w:sz w:val="16"/>
+                          <w:szCs w:val="16"/>
+                        </w:rPr>
+                      </w:pPr>
+                      <w:r>
+                        <w:rPr>
+                          <w:rFonts w:ascii="Times New Roman" w:hAnsi="Times New Roman" w:cs="Times New Roman"/>
+                          <w:color w:val="000000" w:themeColor="text1"/>
+                          <w:sz w:val="16"/>
+                          <w:szCs w:val="16"/>
+                        </w:rPr>
+                        <w:t>Figure</w:t>
+                      </w:r>
+                      <w:r>
+                        <w:rPr>
+                          <w:rFonts w:ascii="Times New Roman" w:hAnsi="Times New Roman" w:cs="Times New Roman"/>
+                          <w:color w:val="000000" w:themeColor="text1"/>
+                          <w:sz w:val="16"/>
+                          <w:szCs w:val="16"/>
+                        </w:rPr>
+                        <w:t xml:space="preserve"> </w:t>
+                      </w:r>
+                      <w:proofErr w:type="gramStart"/>
+                      <w:r>
+                        <w:rPr>
+                          <w:rFonts w:ascii="Times New Roman" w:hAnsi="Times New Roman" w:cs="Times New Roman"/>
+                          <w:color w:val="000000" w:themeColor="text1"/>
+                          <w:sz w:val="16"/>
+                          <w:szCs w:val="16"/>
+                        </w:rPr>
+                        <w:t>14:Spheres</w:t>
+                      </w:r>
+                      <w:proofErr w:type="gramEnd"/>
+                      <w:r>
+                        <w:rPr>
+                          <w:rFonts w:ascii="Times New Roman" w:hAnsi="Times New Roman" w:cs="Times New Roman"/>
+                          <w:color w:val="000000" w:themeColor="text1"/>
+                          <w:sz w:val="16"/>
+                          <w:szCs w:val="16"/>
+                        </w:rPr>
+                        <w:t xml:space="preserve"> by the Lake</w:t>
+                      </w:r>
+                    </w:p>
+                  </w:txbxContent>
+                </v:textbox>
+              </v:rect>
+            </w:pict>
+          </mc:Fallback>
+        </mc:AlternateContent>
+      </w:r>
       <w:r>
         <w:rPr>
           <w:noProof/>
@@ -1525,7 +3055,7 @@
                     </pic:cNvPicPr>
                   </pic:nvPicPr>
                   <pic:blipFill>
-                    <a:blip r:embed="rId19" cstate="print">
+                    <a:blip r:embed="rId20" cstate="print">
                       <a:extLst>
                         <a:ext uri="{28A0092B-C50C-407E-A947-70E740481C1C}">
                           <a14:useLocalDpi xmlns:a14="http://schemas.microsoft.com/office/drawing/2010/main" val="0"/>
@@ -1559,6 +3089,7 @@
     </w:p>
     <w:p>
       <w:pPr>
+        <w:spacing w:before="300"/>
         <w:rPr>
           <w:rFonts w:ascii="Times New Roman" w:hAnsi="Times New Roman" w:cs="Times New Roman"/>
           <w:b/>
@@ -1612,6 +3143,156 @@
           <w:szCs w:val="28"/>
         </w:rPr>
       </w:pPr>
+      <w:r>
+        <w:rPr>
+          <w:rFonts w:ascii="Times New Roman" w:hAnsi="Times New Roman" w:cs="Times New Roman"/>
+          <w:b/>
+          <w:bCs/>
+          <w:noProof/>
+          <w:sz w:val="28"/>
+          <w:szCs w:val="28"/>
+        </w:rPr>
+        <mc:AlternateContent>
+          <mc:Choice Requires="wps">
+            <w:drawing>
+              <wp:anchor distT="0" distB="0" distL="114300" distR="114300" simplePos="0" relativeHeight="251677696" behindDoc="0" locked="0" layoutInCell="1" allowOverlap="1" wp14:anchorId="3C148072" wp14:editId="3B90250D">
+                <wp:simplePos x="0" y="0"/>
+                <wp:positionH relativeFrom="column">
+                  <wp:align>right</wp:align>
+                </wp:positionH>
+                <wp:positionV relativeFrom="paragraph">
+                  <wp:posOffset>2354580</wp:posOffset>
+                </wp:positionV>
+                <wp:extent cx="3185160" cy="228600"/>
+                <wp:effectExtent l="0" t="0" r="15240" b="19050"/>
+                <wp:wrapNone/>
+                <wp:docPr id="456825502" name="Rectangle 1"/>
+                <wp:cNvGraphicFramePr/>
+                <a:graphic xmlns:a="http://schemas.openxmlformats.org/drawingml/2006/main">
+                  <a:graphicData uri="http://schemas.microsoft.com/office/word/2010/wordprocessingShape">
+                    <wps:wsp>
+                      <wps:cNvSpPr/>
+                      <wps:spPr>
+                        <a:xfrm>
+                          <a:off x="0" y="0"/>
+                          <a:ext cx="3185160" cy="228600"/>
+                        </a:xfrm>
+                        <a:prstGeom prst="rect">
+                          <a:avLst/>
+                        </a:prstGeom>
+                        <a:noFill/>
+                        <a:ln>
+                          <a:solidFill>
+                            <a:schemeClr val="bg1"/>
+                          </a:solidFill>
+                        </a:ln>
+                      </wps:spPr>
+                      <wps:style>
+                        <a:lnRef idx="2">
+                          <a:schemeClr val="accent6"/>
+                        </a:lnRef>
+                        <a:fillRef idx="1">
+                          <a:schemeClr val="lt1"/>
+                        </a:fillRef>
+                        <a:effectRef idx="0">
+                          <a:schemeClr val="accent6"/>
+                        </a:effectRef>
+                        <a:fontRef idx="minor">
+                          <a:schemeClr val="dk1"/>
+                        </a:fontRef>
+                      </wps:style>
+                      <wps:txbx>
+                        <w:txbxContent>
+                          <w:p>
+                            <w:pPr>
+                              <w:jc w:val="center"/>
+                              <w:rPr>
+                                <w:rFonts w:ascii="Times New Roman" w:hAnsi="Times New Roman" w:cs="Times New Roman"/>
+                                <w:color w:val="000000" w:themeColor="text1"/>
+                                <w:sz w:val="16"/>
+                                <w:szCs w:val="16"/>
+                              </w:rPr>
+                            </w:pPr>
+                            <w:r>
+                              <w:rPr>
+                                <w:rFonts w:ascii="Times New Roman" w:hAnsi="Times New Roman" w:cs="Times New Roman"/>
+                                <w:color w:val="000000" w:themeColor="text1"/>
+                                <w:sz w:val="16"/>
+                                <w:szCs w:val="16"/>
+                              </w:rPr>
+                              <w:t>Figure 1</w:t>
+                            </w:r>
+                            <w:r>
+                              <w:rPr>
+                                <w:rFonts w:ascii="Times New Roman" w:hAnsi="Times New Roman" w:cs="Times New Roman"/>
+                                <w:color w:val="000000" w:themeColor="text1"/>
+                                <w:sz w:val="16"/>
+                                <w:szCs w:val="16"/>
+                              </w:rPr>
+                              <w:t>5: High Dynamic Range Cornell Box</w:t>
+                            </w:r>
+                          </w:p>
+                        </w:txbxContent>
+                      </wps:txbx>
+                      <wps:bodyPr rot="0" spcFirstLastPara="0" vertOverflow="overflow" horzOverflow="overflow" vert="horz" wrap="square" lIns="91440" tIns="45720" rIns="91440" bIns="45720" numCol="1" spcCol="0" rtlCol="0" fromWordArt="0" anchor="ctr" anchorCtr="0" forceAA="0" compatLnSpc="1">
+                        <a:prstTxWarp prst="textNoShape">
+                          <a:avLst/>
+                        </a:prstTxWarp>
+                        <a:noAutofit/>
+                      </wps:bodyPr>
+                    </wps:wsp>
+                  </a:graphicData>
+                </a:graphic>
+                <wp14:sizeRelH relativeFrom="margin">
+                  <wp14:pctWidth>0</wp14:pctWidth>
+                </wp14:sizeRelH>
+                <wp14:sizeRelV relativeFrom="margin">
+                  <wp14:pctHeight>0</wp14:pctHeight>
+                </wp14:sizeRelV>
+              </wp:anchor>
+            </w:drawing>
+          </mc:Choice>
+          <mc:Fallback>
+            <w:pict>
+              <v:rect w14:anchorId="3C148072" id="_x0000_s1035" style="position:absolute;left:0;text-align:left;margin-left:199.6pt;margin-top:185.4pt;width:250.8pt;height:18pt;z-index:251677696;visibility:visible;mso-wrap-style:square;mso-width-percent:0;mso-height-percent:0;mso-wrap-distance-left:9pt;mso-wrap-distance-top:0;mso-wrap-distance-right:9pt;mso-wrap-distance-bottom:0;mso-position-horizontal:right;mso-position-horizontal-relative:text;mso-position-vertical:absolute;mso-position-vertical-relative:text;mso-width-percent:0;mso-height-percent:0;mso-width-relative:margin;mso-height-relative:margin;v-text-anchor:middle" o:gfxdata="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" filled="f" strokecolor="white [3212]" strokeweight="1pt">
+                <v:textbox>
+                  <w:txbxContent>
+                    <w:p>
+                      <w:pPr>
+                        <w:jc w:val="center"/>
+                        <w:rPr>
+                          <w:rFonts w:ascii="Times New Roman" w:hAnsi="Times New Roman" w:cs="Times New Roman"/>
+                          <w:color w:val="000000" w:themeColor="text1"/>
+                          <w:sz w:val="16"/>
+                          <w:szCs w:val="16"/>
+                        </w:rPr>
+                      </w:pPr>
+                      <w:r>
+                        <w:rPr>
+                          <w:rFonts w:ascii="Times New Roman" w:hAnsi="Times New Roman" w:cs="Times New Roman"/>
+                          <w:color w:val="000000" w:themeColor="text1"/>
+                          <w:sz w:val="16"/>
+                          <w:szCs w:val="16"/>
+                        </w:rPr>
+                        <w:t>Figure 1</w:t>
+                      </w:r>
+                      <w:r>
+                        <w:rPr>
+                          <w:rFonts w:ascii="Times New Roman" w:hAnsi="Times New Roman" w:cs="Times New Roman"/>
+                          <w:color w:val="000000" w:themeColor="text1"/>
+                          <w:sz w:val="16"/>
+                          <w:szCs w:val="16"/>
+                        </w:rPr>
+                        <w:t>5: High Dynamic Range Cornell Box</w:t>
+                      </w:r>
+                    </w:p>
+                  </w:txbxContent>
+                </v:textbox>
+              </v:rect>
+            </w:pict>
+          </mc:Fallback>
+        </mc:AlternateContent>
+      </w:r>
       <w:r>
         <w:rPr>
           <w:noProof/>
@@ -1636,7 +3317,7 @@
                     </pic:cNvPicPr>
                   </pic:nvPicPr>
                   <pic:blipFill>
-                    <a:blip r:embed="rId20" cstate="print">
+                    <a:blip r:embed="rId21" cstate="print">
                       <a:extLst>
                         <a:ext uri="{28A0092B-C50C-407E-A947-70E740481C1C}">
                           <a14:useLocalDpi xmlns:a14="http://schemas.microsoft.com/office/drawing/2010/main" val="0"/>
@@ -1684,123 +3365,205 @@
           <w:sz w:val="28"/>
           <w:szCs w:val="28"/>
         </w:rPr>
+        <w:t>Optimization and Acceleration:</w:t>
+      </w:r>
+    </w:p>
+    <w:p>
+      <w:pPr>
+        <w:rPr>
+          <w:rFonts w:ascii="Times New Roman" w:hAnsi="Times New Roman" w:cs="Times New Roman"/>
+          <w:b/>
+          <w:bCs/>
+        </w:rPr>
+      </w:pPr>
+      <w:r>
+        <w:rPr>
+          <w:rFonts w:ascii="Times New Roman" w:hAnsi="Times New Roman" w:cs="Times New Roman"/>
+          <w:b/>
+          <w:bCs/>
+        </w:rPr>
+        <w:t>Bounding Volume Hierarchies (BVH):</w:t>
+      </w:r>
+    </w:p>
+    <w:p>
+      <w:pPr>
+        <w:rPr>
+          <w:rFonts w:ascii="Times New Roman" w:hAnsi="Times New Roman" w:cs="Times New Roman"/>
+        </w:rPr>
+      </w:pPr>
+      <w:r>
+        <w:rPr>
+          <w:rFonts w:ascii="Times New Roman" w:hAnsi="Times New Roman" w:cs="Times New Roman"/>
+        </w:rPr>
+        <w:t>Without optimization, the ray tracer must test every ray against every object in the scene. That is a lot of intersections, and it takes a long time to get through all of them.</w:t>
+      </w:r>
+    </w:p>
+    <w:p>
+      <w:pPr>
+        <w:rPr>
+          <w:rFonts w:ascii="Times New Roman" w:hAnsi="Times New Roman" w:cs="Times New Roman"/>
+        </w:rPr>
+      </w:pPr>
+      <w:r>
+        <w:rPr>
+          <w:rFonts w:ascii="Times New Roman" w:hAnsi="Times New Roman" w:cs="Times New Roman"/>
+        </w:rPr>
+        <w:t>BVH organizes objects into a tree where each node stores an axis-aligned bounding box (AABB) containing all objects in its subtree. To build it, the objects are sorted along their longest axis and split in half. When testing a ray, if it misses a node’s bounding box, all objects inside that box can be skipped. This reduces the average number of tests for every object. This typically provides a 10-100x speedup depending on scene complexity.</w:t>
+      </w:r>
+    </w:p>
+    <w:p>
+      <w:pPr>
+        <w:rPr>
+          <w:rFonts w:ascii="Times New Roman" w:hAnsi="Times New Roman" w:cs="Times New Roman"/>
+          <w:b/>
+          <w:bCs/>
+        </w:rPr>
+      </w:pPr>
+      <w:r>
+        <w:rPr>
+          <w:rFonts w:ascii="Times New Roman" w:hAnsi="Times New Roman" w:cs="Times New Roman"/>
+          <w:b/>
+          <w:bCs/>
+        </w:rPr>
+        <w:t>Parallelization:</w:t>
+      </w:r>
+    </w:p>
+    <w:p>
+      <w:r>
+        <w:rPr>
+          <w:rFonts w:ascii="Times New Roman" w:hAnsi="Times New Roman" w:cs="Times New Roman"/>
+        </w:rPr>
+        <w:t xml:space="preserve">Modern CPUs have multiple cores that can work simultaneously. Since each pixel can be calculated independently, ray tracing is naturally parallel. OpenMP [6, 7] adds parallelization with a single line of code (`#pragma </w:t>
+      </w:r>
+      <w:proofErr w:type="spellStart"/>
+      <w:r>
+        <w:rPr>
+          <w:rFonts w:ascii="Times New Roman" w:hAnsi="Times New Roman" w:cs="Times New Roman"/>
+        </w:rPr>
+        <w:t>omp</w:t>
+      </w:r>
+      <w:proofErr w:type="spellEnd"/>
+      <w:r>
+        <w:rPr>
+          <w:rFonts w:ascii="Times New Roman" w:hAnsi="Times New Roman" w:cs="Times New Roman"/>
+        </w:rPr>
+        <w:t xml:space="preserve"> parallel for`) placed before the main pixel generation loop. This automatically distributes pixels across all available CPU cores or the number of CPU cores specified by the programmer. The default amount in this ray tracer is the number of CPU cores on the device </w:t>
+      </w:r>
+      <w:r>
+        <w:t>minus 3, leaving cores available for the operating system and other tasks</w:t>
+      </w:r>
+    </w:p>
+    <w:p>
+      <w:pPr>
+        <w:rPr>
+          <w:rFonts w:ascii="Times New Roman" w:hAnsi="Times New Roman" w:cs="Times New Roman"/>
+          <w:b/>
+          <w:bCs/>
+        </w:rPr>
+      </w:pPr>
+      <w:r>
+        <w:rPr>
+          <w:rFonts w:ascii="Times New Roman" w:hAnsi="Times New Roman" w:cs="Times New Roman"/>
+          <w:b/>
+          <w:bCs/>
+        </w:rPr>
+        <w:t>Real-Time Visualization with OpenGL:</w:t>
+      </w:r>
+    </w:p>
+    <w:p>
+      <w:pPr>
+        <w:rPr>
+          <w:rFonts w:ascii="Times New Roman" w:hAnsi="Times New Roman" w:cs="Times New Roman"/>
+        </w:rPr>
+      </w:pPr>
+      <w:r>
+        <w:rPr>
+          <w:rFonts w:ascii="Times New Roman" w:hAnsi="Times New Roman" w:cs="Times New Roman"/>
+        </w:rPr>
+        <w:t>Traditional ray tracing requires waiting for the entire image to finish before seeing results. The OpenGL preview system solves this by displaying the image as it renders. Using GLFW [11] for window management, the current state of the image is periodically uploaded to a texture and displayed on screen. As more samples accumulate, the image gradually becomes clearer and less noisy.</w:t>
+      </w:r>
+    </w:p>
+    <w:p>
+      <w:pPr>
+        <w:rPr>
+          <w:rFonts w:ascii="Times New Roman" w:hAnsi="Times New Roman" w:cs="Times New Roman"/>
+          <w:b/>
+          <w:bCs/>
+        </w:rPr>
+      </w:pPr>
+      <w:r>
+        <w:rPr>
+          <w:rFonts w:ascii="Times New Roman" w:hAnsi="Times New Roman" w:cs="Times New Roman"/>
+          <w:b/>
+          <w:bCs/>
+        </w:rPr>
+        <w:br w:type="column"/>
+      </w:r>
+      <w:r>
+        <w:rPr>
+          <w:rFonts w:ascii="Times New Roman" w:hAnsi="Times New Roman" w:cs="Times New Roman"/>
+          <w:b/>
+          <w:bCs/>
+        </w:rPr>
         <w:lastRenderedPageBreak/>
-        <w:t>Optimization and Acceleration:</w:t>
-      </w:r>
-    </w:p>
-    <w:p>
-      <w:pPr>
-        <w:rPr>
-          <w:rFonts w:ascii="Times New Roman" w:hAnsi="Times New Roman" w:cs="Times New Roman"/>
-          <w:b/>
-          <w:bCs/>
-        </w:rPr>
-      </w:pPr>
-      <w:r>
-        <w:rPr>
-          <w:rFonts w:ascii="Times New Roman" w:hAnsi="Times New Roman" w:cs="Times New Roman"/>
-          <w:b/>
-          <w:bCs/>
-        </w:rPr>
-        <w:t>Bounding Volume Hierarchies (BVH):</w:t>
-      </w:r>
-    </w:p>
-    <w:p>
-      <w:pPr>
-        <w:rPr>
-          <w:rFonts w:ascii="Times New Roman" w:hAnsi="Times New Roman" w:cs="Times New Roman"/>
-        </w:rPr>
-      </w:pPr>
-      <w:r>
-        <w:rPr>
-          <w:rFonts w:ascii="Times New Roman" w:hAnsi="Times New Roman" w:cs="Times New Roman"/>
-        </w:rPr>
-        <w:t>Without optimization, the ray tracer must test every ray against every object in the scene. That is a lot of intersections, and it takes a long time to get through all of them.</w:t>
-      </w:r>
-    </w:p>
-    <w:p>
-      <w:pPr>
-        <w:rPr>
-          <w:rFonts w:ascii="Times New Roman" w:hAnsi="Times New Roman" w:cs="Times New Roman"/>
-        </w:rPr>
-      </w:pPr>
-      <w:r>
-        <w:rPr>
-          <w:rFonts w:ascii="Times New Roman" w:hAnsi="Times New Roman" w:cs="Times New Roman"/>
-        </w:rPr>
-        <w:t>BVH organizes objects into a tree where each node stores an axis-aligned bounding box (AABB) containing all objects in its subtree. To build it, the objects are sorted along their longest axis and split in half. When testing a ray, if it misses a node’s bounding box, all objects inside that box can be skipped. This reduces the average number of tests for every object. This typically provides a 10-100x speedup depending on scene complexity.</w:t>
-      </w:r>
-    </w:p>
-    <w:p>
-      <w:pPr>
-        <w:rPr>
-          <w:rFonts w:ascii="Times New Roman" w:hAnsi="Times New Roman" w:cs="Times New Roman"/>
-          <w:b/>
-          <w:bCs/>
-        </w:rPr>
-      </w:pPr>
-      <w:r>
-        <w:rPr>
-          <w:rFonts w:ascii="Times New Roman" w:hAnsi="Times New Roman" w:cs="Times New Roman"/>
-          <w:b/>
-          <w:bCs/>
-        </w:rPr>
-        <w:t>Parallelization:</w:t>
-      </w:r>
-    </w:p>
-    <w:p>
-      <w:r>
-        <w:rPr>
-          <w:rFonts w:ascii="Times New Roman" w:hAnsi="Times New Roman" w:cs="Times New Roman"/>
-        </w:rPr>
-        <w:t xml:space="preserve">Modern CPUs have multiple cores that can work simultaneously. Since each pixel can be calculated independently, ray tracing is naturally parallel. OpenMP [6, 7] adds parallelization with a single line of code (`#pragma </w:t>
-      </w:r>
-      <w:proofErr w:type="spellStart"/>
-      <w:r>
-        <w:rPr>
-          <w:rFonts w:ascii="Times New Roman" w:hAnsi="Times New Roman" w:cs="Times New Roman"/>
-        </w:rPr>
-        <w:t>omp</w:t>
-      </w:r>
-      <w:proofErr w:type="spellEnd"/>
-      <w:r>
-        <w:rPr>
-          <w:rFonts w:ascii="Times New Roman" w:hAnsi="Times New Roman" w:cs="Times New Roman"/>
-        </w:rPr>
-        <w:t xml:space="preserve"> parallel for`) placed before the main pixel generation loop. This automatically distributes pixels across all available CPU cores or the number of CPU cores specified by the programmer. The default amount in this ray tracer is the number of CPU cores on the device </w:t>
-      </w:r>
-      <w:r>
-        <w:t>minus 3, leaving cores available for the operating system and other tasks</w:t>
-      </w:r>
-    </w:p>
-    <w:p>
-      <w:pPr>
-        <w:rPr>
-          <w:rFonts w:ascii="Times New Roman" w:hAnsi="Times New Roman" w:cs="Times New Roman"/>
-          <w:b/>
-          <w:bCs/>
-        </w:rPr>
-      </w:pPr>
-      <w:r>
-        <w:rPr>
-          <w:rFonts w:ascii="Times New Roman" w:hAnsi="Times New Roman" w:cs="Times New Roman"/>
-          <w:b/>
-          <w:bCs/>
-        </w:rPr>
-        <w:t>Real-Time Visualization with OpenGL:</w:t>
-      </w:r>
-    </w:p>
-    <w:p>
-      <w:pPr>
-        <w:rPr>
-          <w:rFonts w:ascii="Times New Roman" w:hAnsi="Times New Roman" w:cs="Times New Roman"/>
-        </w:rPr>
-      </w:pPr>
-      <w:r>
-        <w:rPr>
-          <w:rFonts w:ascii="Times New Roman" w:hAnsi="Times New Roman" w:cs="Times New Roman"/>
-        </w:rPr>
-        <w:t>Traditional ray tracing requires waiting for the entire image to finish before seeing results. The OpenGL preview system solves this by displaying the image as it renders. Using GLFW [11] for window management, the current state of the image is periodically uploaded to a texture and displayed on screen. As more samples accumulate, the image gradually becomes clearer and less noisy.</w:t>
+        <w:t>Object Instancing:</w:t>
+      </w:r>
+    </w:p>
+    <w:p>
+      <w:pPr>
+        <w:rPr>
+          <w:rFonts w:ascii="Times New Roman" w:hAnsi="Times New Roman" w:cs="Times New Roman"/>
+        </w:rPr>
+      </w:pPr>
+      <w:r>
+        <w:rPr>
+          <w:rFonts w:ascii="Times New Roman" w:hAnsi="Times New Roman" w:cs="Times New Roman"/>
+        </w:rPr>
+        <w:t xml:space="preserve">Object </w:t>
+      </w:r>
+      <w:proofErr w:type="gramStart"/>
+      <w:r>
+        <w:rPr>
+          <w:rFonts w:ascii="Times New Roman" w:hAnsi="Times New Roman" w:cs="Times New Roman"/>
+        </w:rPr>
+        <w:t>instancing</w:t>
+      </w:r>
+      <w:proofErr w:type="gramEnd"/>
+      <w:r>
+        <w:rPr>
+          <w:rFonts w:ascii="Times New Roman" w:hAnsi="Times New Roman" w:cs="Times New Roman"/>
+        </w:rPr>
+        <w:t xml:space="preserve"> allows geometric primitives to be transformed and placed into the scene without duplicating geometry. </w:t>
+      </w:r>
+      <w:r>
+        <w:rPr>
+          <w:rFonts w:ascii="Times New Roman" w:hAnsi="Times New Roman" w:cs="Times New Roman"/>
+        </w:rPr>
+        <w:t>I</w:t>
+      </w:r>
+      <w:r>
+        <w:rPr>
+          <w:rFonts w:ascii="Times New Roman" w:hAnsi="Times New Roman" w:cs="Times New Roman"/>
+        </w:rPr>
+        <w:t>nstances transform rays from world space to object space, test intersection against the base geometry, then transform the hit point and normal back to world space. Th</w:t>
+      </w:r>
+      <w:r>
+        <w:rPr>
+          <w:rFonts w:ascii="Times New Roman" w:hAnsi="Times New Roman" w:cs="Times New Roman"/>
+        </w:rPr>
+        <w:t>is</w:t>
+      </w:r>
+      <w:r>
+        <w:rPr>
+          <w:rFonts w:ascii="Times New Roman" w:hAnsi="Times New Roman" w:cs="Times New Roman"/>
+        </w:rPr>
+        <w:t xml:space="preserve"> implementation includes translation and rotation transformations for positioning rotated </w:t>
+      </w:r>
+      <w:r>
+        <w:rPr>
+          <w:rFonts w:ascii="Times New Roman" w:hAnsi="Times New Roman" w:cs="Times New Roman"/>
+        </w:rPr>
+        <w:t>Boxes and 3D Triangles.</w:t>
       </w:r>
     </w:p>
     <w:p>
@@ -1813,16 +3576,6 @@
           <w:szCs w:val="28"/>
         </w:rPr>
       </w:pPr>
-      <w:r>
-        <w:rPr>
-          <w:rFonts w:ascii="Times New Roman" w:hAnsi="Times New Roman" w:cs="Times New Roman"/>
-          <w:b/>
-          <w:bCs/>
-          <w:sz w:val="28"/>
-          <w:szCs w:val="28"/>
-        </w:rPr>
-        <w:br w:type="column"/>
-      </w:r>
       <w:r>
         <w:rPr>
           <w:rFonts w:ascii="Times New Roman" w:hAnsi="Times New Roman" w:cs="Times New Roman"/>
@@ -1933,7 +3686,17 @@
           <w:sz w:val="28"/>
           <w:szCs w:val="28"/>
         </w:rPr>
-        <w:t>Interesting Images:</w:t>
+        <w:br w:type="column"/>
+      </w:r>
+      <w:r>
+        <w:rPr>
+          <w:rFonts w:ascii="Times New Roman" w:hAnsi="Times New Roman" w:cs="Times New Roman"/>
+          <w:b/>
+          <w:bCs/>
+          <w:sz w:val="28"/>
+          <w:szCs w:val="28"/>
+        </w:rPr>
+        <w:t>Honorable Mentions</w:t>
       </w:r>
       <w:r>
         <w:rPr>
@@ -1949,25 +3712,6 @@
     </w:p>
     <w:p>
       <w:pPr>
-        <w:rPr>
-          <w:rFonts w:ascii="Times New Roman" w:hAnsi="Times New Roman" w:cs="Times New Roman"/>
-          <w:b/>
-          <w:bCs/>
-          <w:noProof/>
-        </w:rPr>
-      </w:pPr>
-      <w:r>
-        <w:rPr>
-          <w:rFonts w:ascii="Times New Roman" w:hAnsi="Times New Roman" w:cs="Times New Roman"/>
-          <w:b/>
-          <w:bCs/>
-          <w:noProof/>
-        </w:rPr>
-        <w:t xml:space="preserve">Final Renders: </w:t>
-      </w:r>
-    </w:p>
-    <w:p>
-      <w:pPr>
         <w:jc w:val="center"/>
         <w:rPr>
           <w:rFonts w:ascii="Times New Roman" w:hAnsi="Times New Roman" w:cs="Times New Roman"/>
@@ -1986,77 +3730,6 @@
           <w:sz w:val="28"/>
           <w:szCs w:val="28"/>
         </w:rPr>
-        <w:drawing>
-          <wp:inline distT="0" distB="0" distL="0" distR="0" wp14:anchorId="46DFF611" wp14:editId="6C68082B">
-            <wp:extent cx="3253740" cy="1828292"/>
-            <wp:effectExtent l="0" t="0" r="3810" b="635"/>
-            <wp:docPr id="1248870735" name="Picture 77" descr="A bat head and balls on a chessboard&#10;&#10;AI-generated content may be incorrect."/>
-            <wp:cNvGraphicFramePr>
-              <a:graphicFrameLocks xmlns:a="http://schemas.openxmlformats.org/drawingml/2006/main" noChangeAspect="1"/>
-            </wp:cNvGraphicFramePr>
-            <a:graphic xmlns:a="http://schemas.openxmlformats.org/drawingml/2006/main">
-              <a:graphicData uri="http://schemas.openxmlformats.org/drawingml/2006/picture">
-                <pic:pic xmlns:pic="http://schemas.openxmlformats.org/drawingml/2006/picture">
-                  <pic:nvPicPr>
-                    <pic:cNvPr id="1248870735" name="Picture 77" descr="A bat head and balls on a chessboard&#10;&#10;AI-generated content may be incorrect."/>
-                    <pic:cNvPicPr>
-                      <a:picLocks noChangeAspect="1" noChangeArrowheads="1"/>
-                    </pic:cNvPicPr>
-                  </pic:nvPicPr>
-                  <pic:blipFill>
-                    <a:blip r:embed="rId21" cstate="print">
-                      <a:extLst>
-                        <a:ext uri="{28A0092B-C50C-407E-A947-70E740481C1C}">
-                          <a14:useLocalDpi xmlns:a14="http://schemas.microsoft.com/office/drawing/2010/main" val="0"/>
-                        </a:ext>
-                      </a:extLst>
-                    </a:blip>
-                    <a:srcRect/>
-                    <a:stretch>
-                      <a:fillRect/>
-                    </a:stretch>
-                  </pic:blipFill>
-                  <pic:spPr bwMode="auto">
-                    <a:xfrm>
-                      <a:off x="0" y="0"/>
-                      <a:ext cx="3261429" cy="1832612"/>
-                    </a:xfrm>
-                    <a:prstGeom prst="rect">
-                      <a:avLst/>
-                    </a:prstGeom>
-                    <a:noFill/>
-                    <a:ln>
-                      <a:noFill/>
-                    </a:ln>
-                  </pic:spPr>
-                </pic:pic>
-              </a:graphicData>
-            </a:graphic>
-          </wp:inline>
-        </w:drawing>
-      </w:r>
-    </w:p>
-    <w:p>
-      <w:pPr>
-        <w:jc w:val="center"/>
-        <w:rPr>
-          <w:rFonts w:ascii="Times New Roman" w:hAnsi="Times New Roman" w:cs="Times New Roman"/>
-          <w:b/>
-          <w:bCs/>
-          <w:sz w:val="28"/>
-          <w:szCs w:val="28"/>
-        </w:rPr>
-      </w:pPr>
-      <w:r>
-        <w:rPr>
-          <w:rFonts w:ascii="Times New Roman" w:hAnsi="Times New Roman" w:cs="Times New Roman"/>
-          <w:b/>
-          <w:bCs/>
-          <w:noProof/>
-          <w:sz w:val="28"/>
-          <w:szCs w:val="28"/>
-        </w:rPr>
-        <w:lastRenderedPageBreak/>
         <w:drawing>
           <wp:inline distT="0" distB="0" distL="0" distR="0" wp14:anchorId="508706AA" wp14:editId="4C9B6B61">
             <wp:extent cx="3200400" cy="1798320"/>
@@ -2109,32 +3782,6 @@
     </w:p>
     <w:p>
       <w:pPr>
-        <w:rPr>
-          <w:rFonts w:ascii="Times New Roman" w:hAnsi="Times New Roman" w:cs="Times New Roman"/>
-          <w:b/>
-          <w:bCs/>
-        </w:rPr>
-      </w:pPr>
-    </w:p>
-    <w:p>
-      <w:pPr>
-        <w:rPr>
-          <w:rFonts w:ascii="Times New Roman" w:hAnsi="Times New Roman" w:cs="Times New Roman"/>
-          <w:b/>
-          <w:bCs/>
-        </w:rPr>
-      </w:pPr>
-      <w:r>
-        <w:rPr>
-          <w:rFonts w:ascii="Times New Roman" w:hAnsi="Times New Roman" w:cs="Times New Roman"/>
-          <w:b/>
-          <w:bCs/>
-        </w:rPr>
-        <w:t>Miscellaneous Renders Throughout the Project:</w:t>
-      </w:r>
-    </w:p>
-    <w:p>
-      <w:pPr>
         <w:jc w:val="center"/>
         <w:rPr>
           <w:rFonts w:ascii="Times New Roman" w:hAnsi="Times New Roman" w:cs="Times New Roman"/>
@@ -2150,9 +3797,9 @@
           <w:noProof/>
         </w:rPr>
         <w:drawing>
-          <wp:inline distT="0" distB="0" distL="0" distR="0" wp14:anchorId="1F63B42E" wp14:editId="41EAA0C2">
-            <wp:extent cx="2971800" cy="2971800"/>
-            <wp:effectExtent l="0" t="0" r="0" b="0"/>
+          <wp:inline distT="0" distB="0" distL="0" distR="0" wp14:anchorId="1F63B42E" wp14:editId="55966D3D">
+            <wp:extent cx="2971800" cy="2049780"/>
+            <wp:effectExtent l="0" t="0" r="0" b="7620"/>
             <wp:docPr id="1471826617" name="Picture 75" descr="A colorful paper cut out of a hexagon&#10;&#10;AI-generated content may be incorrect."/>
             <wp:cNvGraphicFramePr>
               <a:graphicFrameLocks xmlns:a="http://schemas.openxmlformats.org/drawingml/2006/main" noChangeAspect="1"/>
@@ -2166,7 +3813,7 @@
                       <a:picLocks noChangeAspect="1" noChangeArrowheads="1"/>
                     </pic:cNvPicPr>
                   </pic:nvPicPr>
-                  <pic:blipFill>
+                  <pic:blipFill rotWithShape="1">
                     <a:blip r:embed="rId23" cstate="print">
                       <a:extLst>
                         <a:ext uri="{28A0092B-C50C-407E-A947-70E740481C1C}">
@@ -2174,7 +3821,7 @@
                         </a:ext>
                       </a:extLst>
                     </a:blip>
-                    <a:srcRect/>
+                    <a:srcRect t="15385" b="15641"/>
                     <a:stretch>
                       <a:fillRect/>
                     </a:stretch>
@@ -2182,7 +3829,7 @@
                   <pic:spPr bwMode="auto">
                     <a:xfrm>
                       <a:off x="0" y="0"/>
-                      <a:ext cx="2971800" cy="2971800"/>
+                      <a:ext cx="2971800" cy="2049780"/>
                     </a:xfrm>
                     <a:prstGeom prst="rect">
                       <a:avLst/>
@@ -2191,6 +3838,11 @@
                     <a:ln>
                       <a:noFill/>
                     </a:ln>
+                    <a:extLst>
+                      <a:ext uri="{53640926-AAD7-44D8-BBD7-CCE9431645EC}">
+                        <a14:shadowObscured xmlns:a14="http://schemas.microsoft.com/office/drawing/2010/main"/>
+                      </a:ext>
+                    </a:extLst>
                   </pic:spPr>
                 </pic:pic>
               </a:graphicData>

</xml_diff>

<commit_message>
Working on report and rendering some cool images
</commit_message>
<xml_diff>
--- a/Doumentation/Implementation of a Ray Tracer.docx
+++ b/Doumentation/Implementation of a Ray Tracer.docx
@@ -91,27 +91,7 @@
                                 <w:sz w:val="16"/>
                                 <w:szCs w:val="16"/>
                               </w:rPr>
-                              <w:t xml:space="preserve">Figure 1: </w:t>
-                            </w:r>
-                            <w:proofErr w:type="spellStart"/>
-                            <w:r>
-                              <w:rPr>
-                                <w:rFonts w:ascii="Times New Roman" w:hAnsi="Times New Roman" w:cs="Times New Roman"/>
-                                <w:color w:val="FFFFFF" w:themeColor="background1"/>
-                                <w:sz w:val="16"/>
-                                <w:szCs w:val="16"/>
-                              </w:rPr>
-                              <w:t>NightFall’s</w:t>
-                            </w:r>
-                            <w:proofErr w:type="spellEnd"/>
-                            <w:r>
-                              <w:rPr>
-                                <w:rFonts w:ascii="Times New Roman" w:hAnsi="Times New Roman" w:cs="Times New Roman"/>
-                                <w:color w:val="FFFFFF" w:themeColor="background1"/>
-                                <w:sz w:val="16"/>
-                                <w:szCs w:val="16"/>
-                              </w:rPr>
-                              <w:t xml:space="preserve"> Herald</w:t>
+                              <w:t>Figure 1: NightFall’s Herald</w:t>
                             </w:r>
                           </w:p>
                         </w:txbxContent>
@@ -156,27 +136,7 @@
                           <w:sz w:val="16"/>
                           <w:szCs w:val="16"/>
                         </w:rPr>
-                        <w:t xml:space="preserve">Figure 1: </w:t>
-                      </w:r>
-                      <w:proofErr w:type="spellStart"/>
-                      <w:r>
-                        <w:rPr>
-                          <w:rFonts w:ascii="Times New Roman" w:hAnsi="Times New Roman" w:cs="Times New Roman"/>
-                          <w:color w:val="FFFFFF" w:themeColor="background1"/>
-                          <w:sz w:val="16"/>
-                          <w:szCs w:val="16"/>
-                        </w:rPr>
-                        <w:t>NightFall’s</w:t>
-                      </w:r>
-                      <w:proofErr w:type="spellEnd"/>
-                      <w:r>
-                        <w:rPr>
-                          <w:rFonts w:ascii="Times New Roman" w:hAnsi="Times New Roman" w:cs="Times New Roman"/>
-                          <w:color w:val="FFFFFF" w:themeColor="background1"/>
-                          <w:sz w:val="16"/>
-                          <w:szCs w:val="16"/>
-                        </w:rPr>
-                        <w:t xml:space="preserve"> Herald</w:t>
+                        <w:t>Figure 1: NightFall’s Herald</w:t>
                       </w:r>
                     </w:p>
                   </w:txbxContent>
@@ -281,19 +241,11 @@
           <w:docGrid w:linePitch="360"/>
         </w:sectPr>
       </w:pPr>
-      <w:proofErr w:type="gramStart"/>
-      <w:r>
-        <w:rPr>
-          <w:rFonts w:ascii="Times New Roman" w:hAnsi="Times New Roman" w:cs="Times New Roman"/>
-        </w:rPr>
-        <w:t>By</w:t>
-      </w:r>
-      <w:proofErr w:type="gramEnd"/>
-      <w:r>
-        <w:rPr>
-          <w:rFonts w:ascii="Times New Roman" w:hAnsi="Times New Roman" w:cs="Times New Roman"/>
-        </w:rPr>
-        <w:t>: Chloe Atwood</w:t>
+      <w:r>
+        <w:rPr>
+          <w:rFonts w:ascii="Times New Roman" w:hAnsi="Times New Roman" w:cs="Times New Roman"/>
+        </w:rPr>
+        <w:t>By: Chloe Atwood</w:t>
       </w:r>
     </w:p>
     <w:p>
@@ -419,25 +371,7 @@
           <w:i/>
           <w:iCs/>
         </w:rPr>
-        <w:t xml:space="preserve">Physically Based Rendering: From Theory </w:t>
-      </w:r>
-      <w:proofErr w:type="gramStart"/>
-      <w:r>
-        <w:rPr>
-          <w:rFonts w:ascii="Times New Roman" w:hAnsi="Times New Roman" w:cs="Times New Roman"/>
-          <w:i/>
-          <w:iCs/>
-        </w:rPr>
-        <w:t>To</w:t>
-      </w:r>
-      <w:proofErr w:type="gramEnd"/>
-      <w:r>
-        <w:rPr>
-          <w:rFonts w:ascii="Times New Roman" w:hAnsi="Times New Roman" w:cs="Times New Roman"/>
-          <w:i/>
-          <w:iCs/>
-        </w:rPr>
-        <w:t xml:space="preserve"> Implementation</w:t>
+        <w:t>Physically Based Rendering: From Theory To Implementation</w:t>
       </w:r>
       <w:r>
         <w:rPr>
@@ -888,21 +822,7 @@
         <w:rPr>
           <w:rFonts w:ascii="Times New Roman" w:hAnsi="Times New Roman" w:cs="Times New Roman"/>
         </w:rPr>
-        <w:t xml:space="preserve">Triangle meshes are loaded from OBJ files using </w:t>
-      </w:r>
-      <w:proofErr w:type="spellStart"/>
-      <w:r>
-        <w:rPr>
-          <w:rFonts w:ascii="Times New Roman" w:hAnsi="Times New Roman" w:cs="Times New Roman"/>
-        </w:rPr>
-        <w:t>tinyobjloader</w:t>
-      </w:r>
-      <w:proofErr w:type="spellEnd"/>
-      <w:r>
-        <w:rPr>
-          <w:rFonts w:ascii="Times New Roman" w:hAnsi="Times New Roman" w:cs="Times New Roman"/>
-        </w:rPr>
-        <w:t xml:space="preserve"> [10], with each triangle maintaining references to vertex data for normal interpolation and texture mapping.</w:t>
+        <w:t>Triangle meshes are loaded from OBJ files using tinyobjloader [10], with each triangle maintaining references to vertex data for normal interpolation and texture mapping.</w:t>
       </w:r>
     </w:p>
     <w:p>
@@ -991,16 +911,7 @@
                                 <w:sz w:val="16"/>
                                 <w:szCs w:val="16"/>
                               </w:rPr>
-                              <w:t xml:space="preserve">Figure </w:t>
-                            </w:r>
-                            <w:r>
-                              <w:rPr>
-                                <w:rFonts w:ascii="Times New Roman" w:hAnsi="Times New Roman" w:cs="Times New Roman"/>
-                                <w:color w:val="000000" w:themeColor="text1"/>
-                                <w:sz w:val="16"/>
-                                <w:szCs w:val="16"/>
-                              </w:rPr>
-                              <w:t>5: Cornell Bat</w:t>
+                              <w:t>Figure 5: Cornell Bat</w:t>
                             </w:r>
                           </w:p>
                         </w:txbxContent>
@@ -1045,16 +956,7 @@
                           <w:sz w:val="16"/>
                           <w:szCs w:val="16"/>
                         </w:rPr>
-                        <w:t xml:space="preserve">Figure </w:t>
-                      </w:r>
-                      <w:r>
-                        <w:rPr>
-                          <w:rFonts w:ascii="Times New Roman" w:hAnsi="Times New Roman" w:cs="Times New Roman"/>
-                          <w:color w:val="000000" w:themeColor="text1"/>
-                          <w:sz w:val="16"/>
-                          <w:szCs w:val="16"/>
-                        </w:rPr>
-                        <w:t>5: Cornell Bat</w:t>
+                        <w:t>Figure 5: Cornell Bat</w:t>
                       </w:r>
                     </w:p>
                   </w:txbxContent>
@@ -1229,7 +1131,6 @@
         </w:rPr>
         <w:t xml:space="preserve">Emissive materials don't scatter light at all. They instead emit light by directly returning </w:t>
       </w:r>
-      <w:proofErr w:type="gramStart"/>
       <w:r>
         <w:rPr>
           <w:rFonts w:ascii="Times New Roman" w:hAnsi="Times New Roman" w:cs="Times New Roman"/>
@@ -1242,26 +1143,11 @@
         </w:rPr>
         <w:t>color</w:t>
       </w:r>
-      <w:proofErr w:type="gramEnd"/>
-      <w:r>
-        <w:rPr>
-          <w:rFonts w:ascii="Times New Roman" w:hAnsi="Times New Roman" w:cs="Times New Roman"/>
-        </w:rPr>
-        <w:t xml:space="preserve"> value. This allows any object to act as a light source, </w:t>
-      </w:r>
-      <w:proofErr w:type="gramStart"/>
-      <w:r>
-        <w:rPr>
-          <w:rFonts w:ascii="Times New Roman" w:hAnsi="Times New Roman" w:cs="Times New Roman"/>
-        </w:rPr>
-        <w:t>creating area</w:t>
-      </w:r>
-      <w:proofErr w:type="gramEnd"/>
-      <w:r>
-        <w:rPr>
-          <w:rFonts w:ascii="Times New Roman" w:hAnsi="Times New Roman" w:cs="Times New Roman"/>
-        </w:rPr>
-        <w:t xml:space="preserve"> lights that produce soft, realistic lighting.</w:t>
+      <w:r>
+        <w:rPr>
+          <w:rFonts w:ascii="Times New Roman" w:hAnsi="Times New Roman" w:cs="Times New Roman"/>
+        </w:rPr>
+        <w:t xml:space="preserve"> value. This allows any object to act as a light source, creating area lights that produce soft, realistic lighting.</w:t>
       </w:r>
     </w:p>
     <w:p>
@@ -1524,48 +1410,20 @@
         <w:rPr>
           <w:rFonts w:ascii="Times New Roman" w:hAnsi="Times New Roman" w:cs="Times New Roman"/>
         </w:rPr>
-        <w:t xml:space="preserve">The </w:t>
-      </w:r>
-      <w:proofErr w:type="spellStart"/>
-      <w:r>
-        <w:rPr>
-          <w:rFonts w:ascii="Times New Roman" w:hAnsi="Times New Roman" w:cs="Times New Roman"/>
-        </w:rPr>
-        <w:t>stb_image</w:t>
-      </w:r>
-      <w:proofErr w:type="spellEnd"/>
-      <w:r>
-        <w:rPr>
-          <w:rFonts w:ascii="Times New Roman" w:hAnsi="Times New Roman" w:cs="Times New Roman"/>
-        </w:rPr>
-        <w:t xml:space="preserve"> library [9] loads image textures in common formats like PNG and JPG. When a ray hits a surface, texture coordinates determine which pixel of the image to sample for the surface color. Bilinear filtering smooths the result by blending nearby pixels.</w:t>
-      </w:r>
-    </w:p>
-    <w:p>
-      <w:pPr>
-        <w:rPr>
-          <w:rFonts w:ascii="Times New Roman" w:hAnsi="Times New Roman" w:cs="Times New Roman"/>
-        </w:rPr>
-      </w:pPr>
-      <w:r>
-        <w:rPr>
-          <w:rFonts w:ascii="Times New Roman" w:hAnsi="Times New Roman" w:cs="Times New Roman"/>
-        </w:rPr>
-        <w:t xml:space="preserve">Procedural textures generate patterns using math instead of images. The implementation utilizes Perlin noise, which generates smooth, random patterns useful for simulating textures such as marble or wood grain. The noise function takes the 3D hit point as input, allowing the pattern to wrap naturally around objects </w:t>
-      </w:r>
-      <w:proofErr w:type="gramStart"/>
-      <w:r>
-        <w:rPr>
-          <w:rFonts w:ascii="Times New Roman" w:hAnsi="Times New Roman" w:cs="Times New Roman"/>
-        </w:rPr>
-        <w:t>without seams</w:t>
-      </w:r>
-      <w:proofErr w:type="gramEnd"/>
-      <w:r>
-        <w:rPr>
-          <w:rFonts w:ascii="Times New Roman" w:hAnsi="Times New Roman" w:cs="Times New Roman"/>
-        </w:rPr>
-        <w:t>.</w:t>
+        <w:t>The stb_image library [9] loads image textures in common formats like PNG and JPG. When a ray hits a surface, texture coordinates determine which pixel of the image to sample for the surface color. Bilinear filtering smooths the result by blending nearby pixels.</w:t>
+      </w:r>
+    </w:p>
+    <w:p>
+      <w:pPr>
+        <w:rPr>
+          <w:rFonts w:ascii="Times New Roman" w:hAnsi="Times New Roman" w:cs="Times New Roman"/>
+        </w:rPr>
+      </w:pPr>
+      <w:r>
+        <w:rPr>
+          <w:rFonts w:ascii="Times New Roman" w:hAnsi="Times New Roman" w:cs="Times New Roman"/>
+        </w:rPr>
+        <w:t>Procedural textures generate patterns using math instead of images. The implementation utilizes Perlin noise, which generates smooth, random patterns useful for simulating textures such as marble or wood grain. The noise function takes the 3D hit point as input, allowing the pattern to wrap naturally around objects without seams.</w:t>
       </w:r>
     </w:p>
     <w:p>
@@ -2415,35 +2273,7 @@
         <w:rPr>
           <w:rFonts w:ascii="Times New Roman" w:hAnsi="Times New Roman" w:cs="Times New Roman"/>
         </w:rPr>
-        <w:t xml:space="preserve">Triangle meshes naturally have flat faces, which </w:t>
-      </w:r>
-      <w:proofErr w:type="gramStart"/>
-      <w:r>
-        <w:rPr>
-          <w:rFonts w:ascii="Times New Roman" w:hAnsi="Times New Roman" w:cs="Times New Roman"/>
-        </w:rPr>
-        <w:t>creates</w:t>
-      </w:r>
-      <w:proofErr w:type="gramEnd"/>
-      <w:r>
-        <w:rPr>
-          <w:rFonts w:ascii="Times New Roman" w:hAnsi="Times New Roman" w:cs="Times New Roman"/>
-        </w:rPr>
-        <w:t xml:space="preserve"> a faceted appearance even when trying to represent smooth surfaces. Normal interpolation fixes this by storing a normal vector at each vertex that points in the "ideal" direction for a smooth surface. When a ray hits anywhere on the triangle, the three vertex normals are </w:t>
-      </w:r>
-      <w:proofErr w:type="gramStart"/>
-      <w:r>
-        <w:rPr>
-          <w:rFonts w:ascii="Times New Roman" w:hAnsi="Times New Roman" w:cs="Times New Roman"/>
-        </w:rPr>
-        <w:t>blended together</w:t>
-      </w:r>
-      <w:proofErr w:type="gramEnd"/>
-      <w:r>
-        <w:rPr>
-          <w:rFonts w:ascii="Times New Roman" w:hAnsi="Times New Roman" w:cs="Times New Roman"/>
-        </w:rPr>
-        <w:t xml:space="preserve"> using barycentric coordinates to produce a smooth normal. This makes curved objects appear smooth, even when built from triangles.</w:t>
+        <w:t>Triangle meshes naturally have flat faces, which creates a faceted appearance even when trying to represent smooth surfaces. Normal interpolation fixes this by storing a normal vector at each vertex that points in the "ideal" direction for a smooth surface. When a ray hits anywhere on the triangle, the three vertex normals are blended together using barycentric coordinates to produce a smooth normal. This makes curved objects appear smooth, even when built from triangles.</w:t>
       </w:r>
     </w:p>
     <w:p>
@@ -2531,25 +2361,7 @@
                                 <w:sz w:val="16"/>
                                 <w:szCs w:val="16"/>
                               </w:rPr>
-                              <w:t xml:space="preserve">       </w:t>
-                            </w:r>
-                            <w:r>
-                              <w:rPr>
-                                <w:rFonts w:ascii="Times New Roman" w:hAnsi="Times New Roman" w:cs="Times New Roman"/>
-                                <w:color w:val="000000" w:themeColor="text1"/>
-                                <w:sz w:val="16"/>
-                                <w:szCs w:val="16"/>
-                              </w:rPr>
-                              <w:t>Figure 1</w:t>
-                            </w:r>
-                            <w:r>
-                              <w:rPr>
-                                <w:rFonts w:ascii="Times New Roman" w:hAnsi="Times New Roman" w:cs="Times New Roman"/>
-                                <w:color w:val="000000" w:themeColor="text1"/>
-                                <w:sz w:val="16"/>
-                                <w:szCs w:val="16"/>
-                              </w:rPr>
-                              <w:t>2: Pre-NI</w:t>
+                              <w:t xml:space="preserve">       Figure 12: Pre-NI</w:t>
                             </w:r>
                             <w:r>
                               <w:rPr>
@@ -2612,25 +2424,7 @@
                           <w:sz w:val="16"/>
                           <w:szCs w:val="16"/>
                         </w:rPr>
-                        <w:t xml:space="preserve">       </w:t>
-                      </w:r>
-                      <w:r>
-                        <w:rPr>
-                          <w:rFonts w:ascii="Times New Roman" w:hAnsi="Times New Roman" w:cs="Times New Roman"/>
-                          <w:color w:val="000000" w:themeColor="text1"/>
-                          <w:sz w:val="16"/>
-                          <w:szCs w:val="16"/>
-                        </w:rPr>
-                        <w:t>Figure 1</w:t>
-                      </w:r>
-                      <w:r>
-                        <w:rPr>
-                          <w:rFonts w:ascii="Times New Roman" w:hAnsi="Times New Roman" w:cs="Times New Roman"/>
-                          <w:color w:val="000000" w:themeColor="text1"/>
-                          <w:sz w:val="16"/>
-                          <w:szCs w:val="16"/>
-                        </w:rPr>
-                        <w:t>2: Pre-NI</w:t>
+                        <w:t xml:space="preserve">       Figure 12: Pre-NI</w:t>
                       </w:r>
                       <w:r>
                         <w:rPr>
@@ -2817,19 +2611,11 @@
           <w:rFonts w:ascii="Times New Roman" w:hAnsi="Times New Roman" w:cs="Times New Roman"/>
         </w:rPr>
       </w:pPr>
-      <w:proofErr w:type="gramStart"/>
-      <w:r>
-        <w:rPr>
-          <w:rFonts w:ascii="Times New Roman" w:hAnsi="Times New Roman" w:cs="Times New Roman"/>
-        </w:rPr>
-        <w:t>Environment</w:t>
-      </w:r>
-      <w:proofErr w:type="gramEnd"/>
-      <w:r>
-        <w:rPr>
-          <w:rFonts w:ascii="Times New Roman" w:hAnsi="Times New Roman" w:cs="Times New Roman"/>
-        </w:rPr>
-        <w:t xml:space="preserve"> maps provide lighting and reflections from the surrounding world. The implementation uses an equirectangular image (like an unwrapped sphere) that captures a full 360-degree view. When a ray doesn't hit any object in the scene, instead of returning black, it converts its direction into texture coordinates to look up a color from the environment map. This provides realistic sky lighting and allows reflective objects to show their surroundings.</w:t>
+      <w:r>
+        <w:rPr>
+          <w:rFonts w:ascii="Times New Roman" w:hAnsi="Times New Roman" w:cs="Times New Roman"/>
+        </w:rPr>
+        <w:t>Environment maps provide lighting and reflections from the surrounding world. The implementation uses an equirectangular image (like an unwrapped sphere) that captures a full 360-degree view. When a ray doesn't hit any object in the scene, instead of returning black, it converts its direction into texture coordinates to look up a color from the environment map. This provides realistic sky lighting and allows reflective objects to show their surroundings.</w:t>
       </w:r>
     </w:p>
     <w:p>
@@ -2918,36 +2704,7 @@
                                 <w:sz w:val="16"/>
                                 <w:szCs w:val="16"/>
                               </w:rPr>
-                              <w:t>Figure</w:t>
-                            </w:r>
-                            <w:r>
-                              <w:rPr>
-                                <w:rFonts w:ascii="Times New Roman" w:hAnsi="Times New Roman" w:cs="Times New Roman"/>
-                                <w:color w:val="000000" w:themeColor="text1"/>
-                                <w:sz w:val="16"/>
-                                <w:szCs w:val="16"/>
-                              </w:rPr>
-                              <w:t xml:space="preserve"> </w:t>
-                            </w:r>
-                            <w:proofErr w:type="gramStart"/>
-                            <w:r>
-                              <w:rPr>
-                                <w:rFonts w:ascii="Times New Roman" w:hAnsi="Times New Roman" w:cs="Times New Roman"/>
-                                <w:color w:val="000000" w:themeColor="text1"/>
-                                <w:sz w:val="16"/>
-                                <w:szCs w:val="16"/>
-                              </w:rPr>
-                              <w:t>14:Spheres</w:t>
-                            </w:r>
-                            <w:proofErr w:type="gramEnd"/>
-                            <w:r>
-                              <w:rPr>
-                                <w:rFonts w:ascii="Times New Roman" w:hAnsi="Times New Roman" w:cs="Times New Roman"/>
-                                <w:color w:val="000000" w:themeColor="text1"/>
-                                <w:sz w:val="16"/>
-                                <w:szCs w:val="16"/>
-                              </w:rPr>
-                              <w:t xml:space="preserve"> by the Lake</w:t>
+                              <w:t>Figure 14:Spheres by the Lake</w:t>
                             </w:r>
                           </w:p>
                         </w:txbxContent>
@@ -2992,36 +2749,7 @@
                           <w:sz w:val="16"/>
                           <w:szCs w:val="16"/>
                         </w:rPr>
-                        <w:t>Figure</w:t>
-                      </w:r>
-                      <w:r>
-                        <w:rPr>
-                          <w:rFonts w:ascii="Times New Roman" w:hAnsi="Times New Roman" w:cs="Times New Roman"/>
-                          <w:color w:val="000000" w:themeColor="text1"/>
-                          <w:sz w:val="16"/>
-                          <w:szCs w:val="16"/>
-                        </w:rPr>
-                        <w:t xml:space="preserve"> </w:t>
-                      </w:r>
-                      <w:proofErr w:type="gramStart"/>
-                      <w:r>
-                        <w:rPr>
-                          <w:rFonts w:ascii="Times New Roman" w:hAnsi="Times New Roman" w:cs="Times New Roman"/>
-                          <w:color w:val="000000" w:themeColor="text1"/>
-                          <w:sz w:val="16"/>
-                          <w:szCs w:val="16"/>
-                        </w:rPr>
-                        <w:t>14:Spheres</w:t>
-                      </w:r>
-                      <w:proofErr w:type="gramEnd"/>
-                      <w:r>
-                        <w:rPr>
-                          <w:rFonts w:ascii="Times New Roman" w:hAnsi="Times New Roman" w:cs="Times New Roman"/>
-                          <w:color w:val="000000" w:themeColor="text1"/>
-                          <w:sz w:val="16"/>
-                          <w:szCs w:val="16"/>
-                        </w:rPr>
-                        <w:t xml:space="preserve"> by the Lake</w:t>
+                        <w:t>Figure 14:Spheres by the Lake</w:t>
                       </w:r>
                     </w:p>
                   </w:txbxContent>
@@ -3115,21 +2843,7 @@
         <w:rPr>
           <w:rFonts w:ascii="Times New Roman" w:hAnsi="Times New Roman" w:cs="Times New Roman"/>
         </w:rPr>
-        <w:t xml:space="preserve">Regular images store colors as values from 0 to 255, but real light has a much wider range of intensities. Think about how the sunlight is drastically brighter than indoor lighting. HDR images store floating-point values that preserve these </w:t>
-      </w:r>
-      <w:proofErr w:type="gramStart"/>
-      <w:r>
-        <w:rPr>
-          <w:rFonts w:ascii="Times New Roman" w:hAnsi="Times New Roman" w:cs="Times New Roman"/>
-        </w:rPr>
-        <w:t>brightness</w:t>
-      </w:r>
-      <w:proofErr w:type="gramEnd"/>
-      <w:r>
-        <w:rPr>
-          <w:rFonts w:ascii="Times New Roman" w:hAnsi="Times New Roman" w:cs="Times New Roman"/>
-        </w:rPr>
-        <w:t xml:space="preserve"> relationships. The renderer keeps all calculations in HDR, only converting to regular values at the very end using tone mapping. This is especially important for environment maps, where maintaining the relative brightness differences creates realistic lighting.</w:t>
+        <w:t>Regular images store colors as values from 0 to 255, but real light has a much wider range of intensities. Think about how the sunlight is drastically brighter than indoor lighting. HDR images store floating-point values that preserve these brightness relationships. The renderer keeps all calculations in HDR, only converting to regular values at the very end using tone mapping. This is especially important for environment maps, where maintaining the relative brightness differences creates realistic lighting.</w:t>
       </w:r>
     </w:p>
     <w:p>
@@ -3220,16 +2934,7 @@
                                 <w:sz w:val="16"/>
                                 <w:szCs w:val="16"/>
                               </w:rPr>
-                              <w:t>Figure 1</w:t>
-                            </w:r>
-                            <w:r>
-                              <w:rPr>
-                                <w:rFonts w:ascii="Times New Roman" w:hAnsi="Times New Roman" w:cs="Times New Roman"/>
-                                <w:color w:val="000000" w:themeColor="text1"/>
-                                <w:sz w:val="16"/>
-                                <w:szCs w:val="16"/>
-                              </w:rPr>
-                              <w:t>5: High Dynamic Range Cornell Box</w:t>
+                              <w:t>Figure 15: High Dynamic Range Cornell Box</w:t>
                             </w:r>
                           </w:p>
                         </w:txbxContent>
@@ -3274,16 +2979,7 @@
                           <w:sz w:val="16"/>
                           <w:szCs w:val="16"/>
                         </w:rPr>
-                        <w:t>Figure 1</w:t>
-                      </w:r>
-                      <w:r>
-                        <w:rPr>
-                          <w:rFonts w:ascii="Times New Roman" w:hAnsi="Times New Roman" w:cs="Times New Roman"/>
-                          <w:color w:val="000000" w:themeColor="text1"/>
-                          <w:sz w:val="16"/>
-                          <w:szCs w:val="16"/>
-                        </w:rPr>
-                        <w:t>5: High Dynamic Range Cornell Box</w:t>
+                        <w:t>Figure 15: High Dynamic Range Cornell Box</w:t>
                       </w:r>
                     </w:p>
                   </w:txbxContent>
@@ -3433,21 +3129,7 @@
         <w:rPr>
           <w:rFonts w:ascii="Times New Roman" w:hAnsi="Times New Roman" w:cs="Times New Roman"/>
         </w:rPr>
-        <w:t xml:space="preserve">Modern CPUs have multiple cores that can work simultaneously. Since each pixel can be calculated independently, ray tracing is naturally parallel. OpenMP [6, 7] adds parallelization with a single line of code (`#pragma </w:t>
-      </w:r>
-      <w:proofErr w:type="spellStart"/>
-      <w:r>
-        <w:rPr>
-          <w:rFonts w:ascii="Times New Roman" w:hAnsi="Times New Roman" w:cs="Times New Roman"/>
-        </w:rPr>
-        <w:t>omp</w:t>
-      </w:r>
-      <w:proofErr w:type="spellEnd"/>
-      <w:r>
-        <w:rPr>
-          <w:rFonts w:ascii="Times New Roman" w:hAnsi="Times New Roman" w:cs="Times New Roman"/>
-        </w:rPr>
-        <w:t xml:space="preserve"> parallel for`) placed before the main pixel generation loop. This automatically distributes pixels across all available CPU cores or the number of CPU cores specified by the programmer. The default amount in this ray tracer is the number of CPU cores on the device </w:t>
+        <w:t xml:space="preserve">Modern CPUs have multiple cores that can work simultaneously. Since each pixel can be calculated independently, ray tracing is naturally parallel. OpenMP [6, 7] adds parallelization with a single line of code (`#pragma omp parallel for`) placed before the main pixel generation loop. This automatically distributes pixels across all available CPU cores or the number of CPU cores specified by the programmer. The default amount in this ray tracer is the number of CPU cores on the device </w:t>
       </w:r>
       <w:r>
         <w:t>minus 3, leaving cores available for the operating system and other tasks</w:t>
@@ -3519,21 +3201,7 @@
         <w:rPr>
           <w:rFonts w:ascii="Times New Roman" w:hAnsi="Times New Roman" w:cs="Times New Roman"/>
         </w:rPr>
-        <w:t xml:space="preserve">Object </w:t>
-      </w:r>
-      <w:proofErr w:type="gramStart"/>
-      <w:r>
-        <w:rPr>
-          <w:rFonts w:ascii="Times New Roman" w:hAnsi="Times New Roman" w:cs="Times New Roman"/>
-        </w:rPr>
-        <w:t>instancing</w:t>
-      </w:r>
-      <w:proofErr w:type="gramEnd"/>
-      <w:r>
-        <w:rPr>
-          <w:rFonts w:ascii="Times New Roman" w:hAnsi="Times New Roman" w:cs="Times New Roman"/>
-        </w:rPr>
-        <w:t xml:space="preserve"> allows geometric primitives to be transformed and placed into the scene without duplicating geometry. </w:t>
+        <w:t xml:space="preserve">Object instancing allows geometric primitives to be transformed and placed into the scene without duplicating geometry. </w:t>
       </w:r>
       <w:r>
         <w:rPr>
@@ -3696,7 +3364,17 @@
           <w:sz w:val="28"/>
           <w:szCs w:val="28"/>
         </w:rPr>
-        <w:t>Honorable Mentions</w:t>
+        <w:t xml:space="preserve">Honorable </w:t>
+      </w:r>
+      <w:r>
+        <w:rPr>
+          <w:rFonts w:ascii="Times New Roman" w:hAnsi="Times New Roman" w:cs="Times New Roman"/>
+          <w:b/>
+          <w:bCs/>
+          <w:sz w:val="28"/>
+          <w:szCs w:val="28"/>
+        </w:rPr>
+        <w:t>Renders:</w:t>
       </w:r>
       <w:r>
         <w:rPr>
@@ -3797,9 +3475,9 @@
           <w:noProof/>
         </w:rPr>
         <w:drawing>
-          <wp:inline distT="0" distB="0" distL="0" distR="0" wp14:anchorId="1F63B42E" wp14:editId="55966D3D">
-            <wp:extent cx="2971800" cy="2049780"/>
-            <wp:effectExtent l="0" t="0" r="0" b="7620"/>
+          <wp:inline distT="0" distB="0" distL="0" distR="0" wp14:anchorId="1F63B42E" wp14:editId="35A90E2C">
+            <wp:extent cx="2971800" cy="1914525"/>
+            <wp:effectExtent l="0" t="0" r="0" b="9525"/>
             <wp:docPr id="1471826617" name="Picture 75" descr="A colorful paper cut out of a hexagon&#10;&#10;AI-generated content may be incorrect."/>
             <wp:cNvGraphicFramePr>
               <a:graphicFrameLocks xmlns:a="http://schemas.openxmlformats.org/drawingml/2006/main" noChangeAspect="1"/>
@@ -3821,7 +3499,7 @@
                         </a:ext>
                       </a:extLst>
                     </a:blip>
-                    <a:srcRect t="15385" b="15641"/>
+                    <a:srcRect t="17309" b="18268"/>
                     <a:stretch>
                       <a:fillRect/>
                     </a:stretch>
@@ -3829,7 +3507,7 @@
                   <pic:spPr bwMode="auto">
                     <a:xfrm>
                       <a:off x="0" y="0"/>
-                      <a:ext cx="2971800" cy="2049780"/>
+                      <a:ext cx="2971800" cy="1914525"/>
                     </a:xfrm>
                     <a:prstGeom prst="rect">
                       <a:avLst/>
@@ -3858,10 +3536,10 @@
           <w:noProof/>
         </w:rPr>
         <w:drawing>
-          <wp:inline distT="0" distB="0" distL="0" distR="0" wp14:anchorId="6B3E5D72" wp14:editId="556448D8">
-            <wp:extent cx="3002280" cy="1679847"/>
-            <wp:effectExtent l="0" t="0" r="7620" b="0"/>
-            <wp:docPr id="692715317" name="Picture 73" descr="A group of colorful lights&#10;&#10;AI-generated content may be incorrect."/>
+          <wp:inline distT="0" distB="0" distL="0" distR="0" wp14:anchorId="356ACBD0" wp14:editId="6C22C43F">
+            <wp:extent cx="3200400" cy="1800225"/>
+            <wp:effectExtent l="0" t="0" r="0" b="9525"/>
+            <wp:docPr id="1354330802" name="Picture 11"/>
             <wp:cNvGraphicFramePr>
               <a:graphicFrameLocks xmlns:a="http://schemas.openxmlformats.org/drawingml/2006/main" noChangeAspect="1"/>
             </wp:cNvGraphicFramePr>
@@ -3869,13 +3547,13 @@
               <a:graphicData uri="http://schemas.openxmlformats.org/drawingml/2006/picture">
                 <pic:pic xmlns:pic="http://schemas.openxmlformats.org/drawingml/2006/picture">
                   <pic:nvPicPr>
-                    <pic:cNvPr id="692715317" name="Picture 73" descr="A group of colorful lights&#10;&#10;AI-generated content may be incorrect."/>
+                    <pic:cNvPr id="0" name="Picture 1"/>
                     <pic:cNvPicPr>
                       <a:picLocks noChangeAspect="1" noChangeArrowheads="1"/>
                     </pic:cNvPicPr>
                   </pic:nvPicPr>
                   <pic:blipFill>
-                    <a:blip r:embed="rId24">
+                    <a:blip r:embed="rId24" cstate="print">
                       <a:extLst>
                         <a:ext uri="{28A0092B-C50C-407E-A947-70E740481C1C}">
                           <a14:useLocalDpi xmlns:a14="http://schemas.microsoft.com/office/drawing/2010/main" val="0"/>
@@ -3890,7 +3568,7 @@
                   <pic:spPr bwMode="auto">
                     <a:xfrm>
                       <a:off x="0" y="0"/>
-                      <a:ext cx="3007979" cy="1683036"/>
+                      <a:ext cx="3200400" cy="1800225"/>
                     </a:xfrm>
                     <a:prstGeom prst="rect">
                       <a:avLst/>
@@ -3924,10 +3602,10 @@
           <w:noProof/>
         </w:rPr>
         <w:drawing>
-          <wp:inline distT="0" distB="0" distL="0" distR="0" wp14:anchorId="5293D493" wp14:editId="0534DF0A">
-            <wp:extent cx="1539240" cy="1539240"/>
-            <wp:effectExtent l="0" t="0" r="3810" b="3810"/>
-            <wp:docPr id="82602966" name="Picture 72" descr="A room with a black box in it&#10;&#10;AI-generated content may be incorrect."/>
+          <wp:inline distT="0" distB="0" distL="0" distR="0" wp14:anchorId="4ECFF5AF" wp14:editId="2FEE82F5">
+            <wp:extent cx="3200400" cy="1800225"/>
+            <wp:effectExtent l="0" t="0" r="0" b="9525"/>
+            <wp:docPr id="2060997292" name="Picture 12"/>
             <wp:cNvGraphicFramePr>
               <a:graphicFrameLocks xmlns:a="http://schemas.openxmlformats.org/drawingml/2006/main" noChangeAspect="1"/>
             </wp:cNvGraphicFramePr>
@@ -3935,7 +3613,7 @@
               <a:graphicData uri="http://schemas.openxmlformats.org/drawingml/2006/picture">
                 <pic:pic xmlns:pic="http://schemas.openxmlformats.org/drawingml/2006/picture">
                   <pic:nvPicPr>
-                    <pic:cNvPr id="82602966" name="Picture 72" descr="A room with a black box in it&#10;&#10;AI-generated content may be incorrect."/>
+                    <pic:cNvPr id="0" name="Picture 2"/>
                     <pic:cNvPicPr>
                       <a:picLocks noChangeAspect="1" noChangeArrowheads="1"/>
                     </pic:cNvPicPr>
@@ -3956,7 +3634,7 @@
                   <pic:spPr bwMode="auto">
                     <a:xfrm>
                       <a:off x="0" y="0"/>
-                      <a:ext cx="1539240" cy="1539240"/>
+                      <a:ext cx="3200400" cy="1800225"/>
                     </a:xfrm>
                     <a:prstGeom prst="rect">
                       <a:avLst/>
@@ -3972,6 +3650,16 @@
           </wp:inline>
         </w:drawing>
       </w:r>
+    </w:p>
+    <w:p>
+      <w:pPr>
+        <w:jc w:val="center"/>
+        <w:rPr>
+          <w:rFonts w:ascii="Times New Roman" w:hAnsi="Times New Roman" w:cs="Times New Roman"/>
+          <w:b/>
+          <w:bCs/>
+        </w:rPr>
+      </w:pPr>
       <w:r>
         <w:rPr>
           <w:rFonts w:ascii="Times New Roman" w:hAnsi="Times New Roman" w:cs="Times New Roman"/>
@@ -3979,11 +3667,12 @@
           <w:bCs/>
           <w:noProof/>
         </w:rPr>
+        <w:lastRenderedPageBreak/>
         <w:drawing>
-          <wp:inline distT="0" distB="0" distL="0" distR="0" wp14:anchorId="0C4EF67A" wp14:editId="0AA55EDC">
-            <wp:extent cx="1532146" cy="1524635"/>
-            <wp:effectExtent l="0" t="0" r="0" b="0"/>
-            <wp:docPr id="267656489" name="Picture 71" descr="A black and white image of a sphere&#10;&#10;AI-generated content may be incorrect."/>
+          <wp:inline distT="0" distB="0" distL="0" distR="0" wp14:anchorId="602E1CB5" wp14:editId="0AC48351">
+            <wp:extent cx="3200400" cy="1800225"/>
+            <wp:effectExtent l="0" t="0" r="0" b="9525"/>
+            <wp:docPr id="8006535" name="Picture 13"/>
             <wp:cNvGraphicFramePr>
               <a:graphicFrameLocks xmlns:a="http://schemas.openxmlformats.org/drawingml/2006/main" noChangeAspect="1"/>
             </wp:cNvGraphicFramePr>
@@ -3991,20 +3680,20 @@
               <a:graphicData uri="http://schemas.openxmlformats.org/drawingml/2006/picture">
                 <pic:pic xmlns:pic="http://schemas.openxmlformats.org/drawingml/2006/picture">
                   <pic:nvPicPr>
-                    <pic:cNvPr id="267656489" name="Picture 71" descr="A black and white image of a sphere&#10;&#10;AI-generated content may be incorrect."/>
+                    <pic:cNvPr id="0" name="Picture 3"/>
                     <pic:cNvPicPr>
                       <a:picLocks noChangeAspect="1" noChangeArrowheads="1"/>
                     </pic:cNvPicPr>
                   </pic:nvPicPr>
-                  <pic:blipFill rotWithShape="1">
-                    <a:blip r:embed="rId26">
+                  <pic:blipFill>
+                    <a:blip r:embed="rId26" cstate="print">
                       <a:extLst>
                         <a:ext uri="{28A0092B-C50C-407E-A947-70E740481C1C}">
                           <a14:useLocalDpi xmlns:a14="http://schemas.microsoft.com/office/drawing/2010/main" val="0"/>
                         </a:ext>
                       </a:extLst>
                     </a:blip>
-                    <a:srcRect l="26184" r="16992"/>
+                    <a:srcRect/>
                     <a:stretch>
                       <a:fillRect/>
                     </a:stretch>
@@ -4012,7 +3701,7 @@
                   <pic:spPr bwMode="auto">
                     <a:xfrm>
                       <a:off x="0" y="0"/>
-                      <a:ext cx="1536844" cy="1529310"/>
+                      <a:ext cx="3200400" cy="1800225"/>
                     </a:xfrm>
                     <a:prstGeom prst="rect">
                       <a:avLst/>
@@ -4021,11 +3710,6 @@
                     <a:ln>
                       <a:noFill/>
                     </a:ln>
-                    <a:extLst>
-                      <a:ext uri="{53640926-AAD7-44D8-BBD7-CCE9431645EC}">
-                        <a14:shadowObscured xmlns:a14="http://schemas.microsoft.com/office/drawing/2010/main"/>
-                      </a:ext>
-                    </a:extLst>
                   </pic:spPr>
                 </pic:pic>
               </a:graphicData>
@@ -4052,28 +3736,6 @@
           <w:sz w:val="28"/>
           <w:szCs w:val="28"/>
         </w:rPr>
-        <w:br w:type="page"/>
-      </w:r>
-    </w:p>
-    <w:p>
-      <w:pPr>
-        <w:rPr>
-          <w:rFonts w:ascii="Times New Roman" w:hAnsi="Times New Roman" w:cs="Times New Roman"/>
-          <w:b/>
-          <w:bCs/>
-          <w:sz w:val="28"/>
-          <w:szCs w:val="28"/>
-        </w:rPr>
-      </w:pPr>
-      <w:r>
-        <w:rPr>
-          <w:rFonts w:ascii="Times New Roman" w:hAnsi="Times New Roman" w:cs="Times New Roman"/>
-          <w:b/>
-          <w:bCs/>
-          <w:sz w:val="28"/>
-          <w:szCs w:val="28"/>
-        </w:rPr>
-        <w:lastRenderedPageBreak/>
         <w:t>References:</w:t>
       </w:r>
     </w:p>
@@ -4143,21 +3805,7 @@
         <w:rPr>
           <w:rFonts w:ascii="Times New Roman" w:hAnsi="Times New Roman" w:cs="Times New Roman"/>
         </w:rPr>
-        <w:t xml:space="preserve">[4] Matt Pharr, Wenzel Jakob, Greg Humphreys et al., “Physically Based Rendering: From Theory </w:t>
-      </w:r>
-      <w:proofErr w:type="gramStart"/>
-      <w:r>
-        <w:rPr>
-          <w:rFonts w:ascii="Times New Roman" w:hAnsi="Times New Roman" w:cs="Times New Roman"/>
-        </w:rPr>
-        <w:t>To</w:t>
-      </w:r>
-      <w:proofErr w:type="gramEnd"/>
-      <w:r>
-        <w:rPr>
-          <w:rFonts w:ascii="Times New Roman" w:hAnsi="Times New Roman" w:cs="Times New Roman"/>
-        </w:rPr>
-        <w:t xml:space="preserve"> Implementation,” [Online], https://pbr-book.org/ (accessed Dec. 2, 2025). </w:t>
+        <w:t>[4] Matt Pharr, Wenzel Jakob, Greg Humphreys et al., “Physically Based Rendering: From Theory To Implementation,” [Online], https://pbr-book.org/ (accessed Dec. 2, 2025). </w:t>
       </w:r>
     </w:p>
     <w:p>
@@ -4243,75 +3891,33 @@
         <w:rPr>
           <w:rFonts w:ascii="Times New Roman" w:hAnsi="Times New Roman" w:cs="Times New Roman"/>
         </w:rPr>
-        <w:t>[8] “</w:t>
-      </w:r>
-      <w:proofErr w:type="spellStart"/>
-      <w:r>
-        <w:rPr>
-          <w:rFonts w:ascii="Times New Roman" w:hAnsi="Times New Roman" w:cs="Times New Roman"/>
-        </w:rPr>
-        <w:t>std_write.h</w:t>
-      </w:r>
-      <w:proofErr w:type="spellEnd"/>
-      <w:r>
-        <w:rPr>
-          <w:rFonts w:ascii="Times New Roman" w:hAnsi="Times New Roman" w:cs="Times New Roman"/>
-        </w:rPr>
-        <w:t>” GitHub. [Online], https://github.com/nothings/stb/blob/master/stb_image_write.h (accessed Dec. 2, 2025). </w:t>
-      </w:r>
-    </w:p>
-    <w:p>
-      <w:pPr>
-        <w:rPr>
-          <w:rFonts w:ascii="Times New Roman" w:hAnsi="Times New Roman" w:cs="Times New Roman"/>
-        </w:rPr>
-      </w:pPr>
-      <w:r>
-        <w:rPr>
-          <w:rFonts w:ascii="Times New Roman" w:hAnsi="Times New Roman" w:cs="Times New Roman"/>
-        </w:rPr>
-        <w:t>[9] “</w:t>
-      </w:r>
-      <w:proofErr w:type="spellStart"/>
-      <w:r>
-        <w:rPr>
-          <w:rFonts w:ascii="Times New Roman" w:hAnsi="Times New Roman" w:cs="Times New Roman"/>
-        </w:rPr>
-        <w:t>std_image.h</w:t>
-      </w:r>
-      <w:proofErr w:type="spellEnd"/>
-      <w:r>
-        <w:rPr>
-          <w:rFonts w:ascii="Times New Roman" w:hAnsi="Times New Roman" w:cs="Times New Roman"/>
-        </w:rPr>
-        <w:t>” GitHub. [Online], https://raw.githubusercontent.com/nothings/stb/master/stb_image.h (accessed Dec. 2, 2025). </w:t>
-      </w:r>
-    </w:p>
-    <w:p>
-      <w:pPr>
-        <w:rPr>
-          <w:rFonts w:ascii="Times New Roman" w:hAnsi="Times New Roman" w:cs="Times New Roman"/>
-        </w:rPr>
-      </w:pPr>
-      <w:r>
-        <w:rPr>
-          <w:rFonts w:ascii="Times New Roman" w:hAnsi="Times New Roman" w:cs="Times New Roman"/>
-        </w:rPr>
-        <w:t>[10] “</w:t>
-      </w:r>
-      <w:proofErr w:type="spellStart"/>
-      <w:r>
-        <w:rPr>
-          <w:rFonts w:ascii="Times New Roman" w:hAnsi="Times New Roman" w:cs="Times New Roman"/>
-        </w:rPr>
-        <w:t>tinobjloader.h</w:t>
-      </w:r>
-      <w:proofErr w:type="spellEnd"/>
-      <w:r>
-        <w:rPr>
-          <w:rFonts w:ascii="Times New Roman" w:hAnsi="Times New Roman" w:cs="Times New Roman"/>
-        </w:rPr>
-        <w:t>” GitHub. [Online], https://github.com/tinyobjloader/tinyobjloader (accessed Dec. 2, 2025). </w:t>
+        <w:t>[8] “std_write.h” GitHub. [Online], https://github.com/nothings/stb/blob/master/stb_image_write.h (accessed Dec. 2, 2025). </w:t>
+      </w:r>
+    </w:p>
+    <w:p>
+      <w:pPr>
+        <w:rPr>
+          <w:rFonts w:ascii="Times New Roman" w:hAnsi="Times New Roman" w:cs="Times New Roman"/>
+        </w:rPr>
+      </w:pPr>
+      <w:r>
+        <w:rPr>
+          <w:rFonts w:ascii="Times New Roman" w:hAnsi="Times New Roman" w:cs="Times New Roman"/>
+        </w:rPr>
+        <w:t>[9] “std_image.h” GitHub. [Online], https://raw.githubusercontent.com/nothings/stb/master/stb_image.h (accessed Dec. 2, 2025). </w:t>
+      </w:r>
+    </w:p>
+    <w:p>
+      <w:pPr>
+        <w:rPr>
+          <w:rFonts w:ascii="Times New Roman" w:hAnsi="Times New Roman" w:cs="Times New Roman"/>
+        </w:rPr>
+      </w:pPr>
+      <w:r>
+        <w:rPr>
+          <w:rFonts w:ascii="Times New Roman" w:hAnsi="Times New Roman" w:cs="Times New Roman"/>
+        </w:rPr>
+        <w:t>[10] “tinobjloader.h” GitHub. [Online], https://github.com/tinyobjloader/tinyobjloader (accessed Dec. 2, 2025). </w:t>
       </w:r>
     </w:p>
     <w:p>
@@ -4354,21 +3960,7 @@
         <w:rPr>
           <w:rFonts w:ascii="Times New Roman" w:hAnsi="Times New Roman" w:cs="Times New Roman"/>
         </w:rPr>
-        <w:t>[12] “</w:t>
-      </w:r>
-      <w:proofErr w:type="spellStart"/>
-      <w:r>
-        <w:rPr>
-          <w:rFonts w:ascii="Times New Roman" w:hAnsi="Times New Roman" w:cs="Times New Roman"/>
-        </w:rPr>
-        <w:t>freepik</w:t>
-      </w:r>
-      <w:proofErr w:type="spellEnd"/>
-      <w:r>
-        <w:rPr>
-          <w:rFonts w:ascii="Times New Roman" w:hAnsi="Times New Roman" w:cs="Times New Roman"/>
-        </w:rPr>
-        <w:t>,” FREEPIK, https://www.freepik.com/ (accessed Dec. 2, 2025). </w:t>
+        <w:t>[12] “freepik,” FREEPIK, https://www.freepik.com/ (accessed Dec. 2, 2025). </w:t>
       </w:r>
     </w:p>
     <w:p>

</xml_diff>